<commit_message>
v1.2.0: Stop button, simpler File menu, edge-amplitude floor, doc refresh
- Stop button: cancel a running scan at the next safe checkpoint
  (between channels, between files). Pending channel futures get
  cancelled; partial results and per-folder reports are still committed.
- Boundary refinement floor: edges of detected events can no longer
  extend into regions whose local pp is below the user's Amp >= setting,
  so the reported event respects the amplitude threshold throughout.
- File menu simplification: drop the redundant "Scan Baselines..." menu
  entry; the toolbar button and Ctrl+Shift+O still trigger that flow.
- Regenerate user guide for v1.2.0 with the full updated feature set.

Co-Authored-By: Claude Opus 4.6 <noreply@anthropic.com>
</commit_message>
<xml_diff>
--- a/doc/Step Noise Finder - User Guide.docx
+++ b/doc/Step Noise Finder - User Guide.docx
@@ -46,7 +46,7 @@
           <w:sz w:val="28"/>
           <w:szCs w:val="28"/>
         </w:rPr>
-        <w:t xml:space="preserve">Version 1.0.0</w:t>
+        <w:t xml:space="preserve">Version 1.2.0</w:t>
       </w:r>
     </w:p>
     <w:p>
@@ -132,7 +132,7 @@
           <w:sz w:val="22"/>
           <w:szCs w:val="22"/>
         </w:rPr>
-        <w:t xml:space="preserve">The Step Noise Finder is a standalone desktop application that automatically scans all channels in one or more TDD baseline files and identifies regions containing periodic step noise. It is designed for Nabsys HD-Mapping instruments that produce multi-channel voltage data (typically 256 channels at 100 Hz).</w:t>
+        <w:t xml:space="preserve">The Step Noise Finder is a standalone desktop application that automatically scans every channel of one or more TDD baseline files and identifies regions containing step noise. It is designed for Nabsys HD-Mapping instruments that produce multi-channel voltage data (typically 256 channels).</w:t>
       </w:r>
     </w:p>
     <w:p>
@@ -145,7 +145,141 @@
           <w:sz w:val="22"/>
           <w:szCs w:val="22"/>
         </w:rPr>
-        <w:t xml:space="preserve">Step noise is a characteristic interference pattern where the signal abruptly rises, holds at an elevated level, then falls back in a repeating periodic pattern. The application detects step noise in the 4–20 Hz frequency range with configurable amplitude thresholds.</w:t>
+        <w:t xml:space="preserve">Step noise is a characteristic interference pattern where the signal abruptly rises, holds at an elevated level, then falls back, repeating in a periodic pattern. The application detects step noise in the 4–20 Hz frequency range with configurable amplitude thresholds, and offers a separate envelope mode for catching non-periodic bursts of activity in the same band.</w:t>
+      </w:r>
+    </w:p>
+    <w:p>
+      <w:pPr>
+        <w:pStyle w:val="Heading2"/>
+      </w:pPr>
+      <w:r>
+        <w:t xml:space="preserve">1.1 What's New in 1.2.0</w:t>
+      </w:r>
+    </w:p>
+    <w:p>
+      <w:pPr>
+        <w:pStyle w:val="ListParagraph"/>
+        <w:numPr>
+          <w:ilvl w:val="0"/>
+          <w:numId w:val="2"/>
+        </w:numPr>
+        <w:spacing w:after="60"/>
+      </w:pPr>
+      <w:r>
+        <w:rPr>
+          <w:rFonts w:ascii="Arial" w:cs="Arial" w:eastAsia="Arial" w:hAnsi="Arial"/>
+          <w:sz w:val="22"/>
+          <w:szCs w:val="22"/>
+        </w:rPr>
+        <w:t xml:space="preserve">Envelope-mode detection — catches bursty events that aren't strictly periodic.</w:t>
+      </w:r>
+    </w:p>
+    <w:p>
+      <w:pPr>
+        <w:pStyle w:val="ListParagraph"/>
+        <w:numPr>
+          <w:ilvl w:val="0"/>
+          <w:numId w:val="2"/>
+        </w:numPr>
+        <w:spacing w:after="60"/>
+      </w:pPr>
+      <w:r>
+        <w:rPr>
+          <w:rFonts w:ascii="Arial" w:cs="Arial" w:eastAsia="Arial" w:hAnsi="Arial"/>
+          <w:sz w:val="22"/>
+          <w:szCs w:val="22"/>
+        </w:rPr>
+        <w:t xml:space="preserve">Cross-file merging — a step-noise event that spans several consecutive TDD files is reported as a single event.</w:t>
+      </w:r>
+    </w:p>
+    <w:p>
+      <w:pPr>
+        <w:pStyle w:val="ListParagraph"/>
+        <w:numPr>
+          <w:ilvl w:val="0"/>
+          <w:numId w:val="2"/>
+        </w:numPr>
+        <w:spacing w:after="60"/>
+      </w:pPr>
+      <w:r>
+        <w:rPr>
+          <w:rFonts w:ascii="Arial" w:cs="Arial" w:eastAsia="Arial" w:hAnsi="Arial"/>
+          <w:sz w:val="22"/>
+          <w:szCs w:val="22"/>
+        </w:rPr>
+        <w:t xml:space="preserve">Recursive Scan All Runs — point at a top-level data root and the app walks the tree, finding every folder containing *Baseline*.tdd files.</w:t>
+      </w:r>
+    </w:p>
+    <w:p>
+      <w:pPr>
+        <w:pStyle w:val="ListParagraph"/>
+        <w:numPr>
+          <w:ilvl w:val="0"/>
+          <w:numId w:val="2"/>
+        </w:numPr>
+        <w:spacing w:after="60"/>
+      </w:pPr>
+      <w:r>
+        <w:rPr>
+          <w:rFonts w:ascii="Arial" w:cs="Arial" w:eastAsia="Arial" w:hAnsi="Arial"/>
+          <w:sz w:val="22"/>
+          <w:szCs w:val="22"/>
+        </w:rPr>
+        <w:t xml:space="preserve">Channel-level parallelism — scans use all CPU cores; combined with FFT autocorrelation this is roughly 10–30× faster than the previous serial implementation.</w:t>
+      </w:r>
+    </w:p>
+    <w:p>
+      <w:pPr>
+        <w:pStyle w:val="ListParagraph"/>
+        <w:numPr>
+          <w:ilvl w:val="0"/>
+          <w:numId w:val="2"/>
+        </w:numPr>
+        <w:spacing w:after="60"/>
+      </w:pPr>
+      <w:r>
+        <w:rPr>
+          <w:rFonts w:ascii="Arial" w:cs="Arial" w:eastAsia="Arial" w:hAnsi="Arial"/>
+          <w:sz w:val="22"/>
+          <w:szCs w:val="22"/>
+        </w:rPr>
+        <w:t xml:space="preserve">Sortable result columns and a per-folder Sherlock-compatible JSON report alongside the existing text report.</w:t>
+      </w:r>
+    </w:p>
+    <w:p>
+      <w:pPr>
+        <w:pStyle w:val="ListParagraph"/>
+        <w:numPr>
+          <w:ilvl w:val="0"/>
+          <w:numId w:val="2"/>
+        </w:numPr>
+        <w:spacing w:after="60"/>
+      </w:pPr>
+      <w:r>
+        <w:rPr>
+          <w:rFonts w:ascii="Arial" w:cs="Arial" w:eastAsia="Arial" w:hAnsi="Arial"/>
+          <w:sz w:val="22"/>
+          <w:szCs w:val="22"/>
+        </w:rPr>
+        <w:t xml:space="preserve">Saved settings — the toolbar parameters persist between runs in step_noise_finder_config.json.</w:t>
+      </w:r>
+    </w:p>
+    <w:p>
+      <w:pPr>
+        <w:pStyle w:val="ListParagraph"/>
+        <w:numPr>
+          <w:ilvl w:val="0"/>
+          <w:numId w:val="2"/>
+        </w:numPr>
+        <w:spacing w:after="60"/>
+      </w:pPr>
+      <w:r>
+        <w:rPr>
+          <w:rFonts w:ascii="Arial" w:cs="Arial" w:eastAsia="Arial" w:hAnsi="Arial"/>
+          <w:sz w:val="22"/>
+          <w:szCs w:val="22"/>
+        </w:rPr>
+        <w:t xml:space="preserve">8 GB bounded LRU cache — large batch scans no longer crash from memory pressure; files are reloaded transparently if you click a result whose data was evicted.</w:t>
       </w:r>
     </w:p>
     <w:p>
@@ -174,7 +308,7 @@
           <w:sz w:val="22"/>
           <w:szCs w:val="22"/>
         </w:rPr>
-        <w:t xml:space="preserve">Launch the application by running:</w:t>
+        <w:t xml:space="preserve">From a checked-out source tree using the project venv:</w:t>
       </w:r>
     </w:p>
     <w:p>
@@ -188,7 +322,7 @@
           <w:sz w:val="20"/>
           <w:szCs w:val="20"/>
         </w:rPr>
-        <w:t xml:space="preserve">python src/step_finder.py</w:t>
+        <w:t xml:space="preserve">.venv\Scripts\python.exe src\step_finder.py</w:t>
       </w:r>
     </w:p>
     <w:p>
@@ -201,7 +335,7 @@
           <w:sz w:val="22"/>
           <w:szCs w:val="22"/>
         </w:rPr>
-        <w:t xml:space="preserve">Or use the standalone executable:</w:t>
+        <w:t xml:space="preserve">Or use the standalone executable build:</w:t>
       </w:r>
     </w:p>
     <w:p>
@@ -241,7 +375,7 @@
           <w:sz w:val="22"/>
           <w:szCs w:val="22"/>
         </w:rPr>
-        <w:t xml:space="preserve">Python 3.11+ with NumPy, SciPy, and Matplotlib</w:t>
+        <w:t xml:space="preserve">Python 3.13 with NumPy, SciPy, and Matplotlib (or the standalone EXE — no Python required)</w:t>
       </w:r>
     </w:p>
     <w:p>
@@ -259,7 +393,7 @@
           <w:sz w:val="22"/>
           <w:szCs w:val="22"/>
         </w:rPr>
-        <w:t xml:space="preserve">Or the standalone StepNoiseFinder.exe (no Python required)</w:t>
+        <w:t xml:space="preserve">Optional: the sherlock package (Nabsys-Organization/sherlock on GitHub) for JSON RunResults output. Without it the .json sibling reports are silently skipped; the .txt reports are always produced.</w:t>
       </w:r>
     </w:p>
     <w:p>
@@ -295,7 +429,7 @@
           <w:sz w:val="22"/>
           <w:szCs w:val="22"/>
         </w:rPr>
-        <w:t xml:space="preserve">Minimum 4 GB RAM (8 GB recommended for batch scanning)</w:t>
+        <w:t xml:space="preserve">8 GB RAM recommended for large batch scans (the app self-limits its file cache to 8 GB)</w:t>
       </w:r>
     </w:p>
     <w:p>
@@ -316,7 +450,7 @@
           <w:sz w:val="22"/>
           <w:szCs w:val="22"/>
         </w:rPr>
-        <w:t xml:space="preserve">The application window is divided into four areas:</w:t>
+        <w:t xml:space="preserve">The window has four areas: a menu bar, a parameter toolbar, a results table on the left, and a plot panel on the right. A status line at the bottom shows progress and report-write notifications.</w:t>
       </w:r>
     </w:p>
     <w:p>
@@ -324,20 +458,7 @@
         <w:pStyle w:val="Heading2"/>
       </w:pPr>
       <w:r>
-        <w:t xml:space="preserve">3.1 Menu Bar</w:t>
-      </w:r>
-    </w:p>
-    <w:p>
-      <w:pPr>
-        <w:spacing w:after="120"/>
-      </w:pPr>
-      <w:r>
-        <w:rPr>
-          <w:rFonts w:ascii="Arial" w:cs="Arial" w:eastAsia="Arial" w:hAnsi="Arial"/>
-          <w:sz w:val="22"/>
-          <w:szCs w:val="22"/>
-        </w:rPr>
-        <w:t xml:space="preserve">The File menu provides three commands:</w:t>
+        <w:t xml:space="preserve">3.1 File Menu</w:t>
       </w:r>
     </w:p>
     <w:tbl>
@@ -530,7 +651,7 @@
                 <w:sz w:val="20"/>
                 <w:szCs w:val="20"/>
               </w:rPr>
-              <w:t xml:space="preserve">Open a single TDD file for scanning. After loading, press Scan All Channels to analyze.</w:t>
+              <w:t xml:space="preserve">Open one TDD file. Press Scan All Channels afterward to analyze it.</w:t>
             </w:r>
           </w:p>
         </w:tc>
@@ -613,7 +734,7 @@
                 <w:sz w:val="20"/>
                 <w:szCs w:val="20"/>
               </w:rPr>
-              <w:t xml:space="preserve">Open a file picker showing TDD files. Select one or more *Baseline*.tdd files to scan all of them in batch.</w:t>
+              <w:t xml:space="preserve">Custom folder picker showing the *Baseline*.tdd files in the chosen folder. Scans every Baseline TDD in that folder.</w:t>
             </w:r>
           </w:p>
         </w:tc>
@@ -642,6 +763,255 @@
                 <w:sz w:val="20"/>
                 <w:szCs w:val="20"/>
               </w:rPr>
+              <w:t xml:space="preserve">Scan Files…</w:t>
+            </w:r>
+          </w:p>
+        </w:tc>
+        <w:tc>
+          <w:tcPr>
+            <w:tcW w:type="dxa" w:w="1400"/>
+            <w:tcBorders>
+              <w:top w:val="single" w:color="CCCCCC" w:sz="1"/>
+              <w:left w:val="single" w:color="CCCCCC" w:sz="1"/>
+              <w:bottom w:val="single" w:color="CCCCCC" w:sz="1"/>
+              <w:right w:val="single" w:color="CCCCCC" w:sz="1"/>
+            </w:tcBorders>
+            <w:tcMar>
+              <w:top w:type="dxa" w:w="80"/>
+              <w:left w:type="dxa" w:w="120"/>
+              <w:bottom w:type="dxa" w:w="80"/>
+              <w:right w:type="dxa" w:w="120"/>
+            </w:tcMar>
+          </w:tcPr>
+          <w:p>
+            <w:r>
+              <w:rPr>
+                <w:rFonts w:ascii="Arial" w:cs="Arial" w:eastAsia="Arial" w:hAnsi="Arial"/>
+                <w:sz w:val="20"/>
+                <w:szCs w:val="20"/>
+              </w:rPr>
+              <w:t xml:space="preserve"/>
+            </w:r>
+          </w:p>
+        </w:tc>
+        <w:tc>
+          <w:tcPr>
+            <w:tcW w:type="dxa" w:w="5560"/>
+            <w:tcBorders>
+              <w:top w:val="single" w:color="CCCCCC" w:sz="1"/>
+              <w:left w:val="single" w:color="CCCCCC" w:sz="1"/>
+              <w:bottom w:val="single" w:color="CCCCCC" w:sz="1"/>
+              <w:right w:val="single" w:color="CCCCCC" w:sz="1"/>
+            </w:tcBorders>
+            <w:tcMar>
+              <w:top w:type="dxa" w:w="80"/>
+              <w:left w:type="dxa" w:w="120"/>
+              <w:bottom w:type="dxa" w:w="80"/>
+              <w:right w:type="dxa" w:w="120"/>
+            </w:tcMar>
+          </w:tcPr>
+          <w:p>
+            <w:r>
+              <w:rPr>
+                <w:rFonts w:ascii="Arial" w:cs="Arial" w:eastAsia="Arial" w:hAnsi="Arial"/>
+                <w:sz w:val="20"/>
+                <w:szCs w:val="20"/>
+              </w:rPr>
+              <w:t xml:space="preserve">Pick individual TDD files (any *.tdd) and scan only those.</w:t>
+            </w:r>
+          </w:p>
+        </w:tc>
+      </w:tr>
+      <w:tr>
+        <w:tc>
+          <w:tcPr>
+            <w:tcW w:type="dxa" w:w="2400"/>
+            <w:tcBorders>
+              <w:top w:val="single" w:color="CCCCCC" w:sz="1"/>
+              <w:left w:val="single" w:color="CCCCCC" w:sz="1"/>
+              <w:bottom w:val="single" w:color="CCCCCC" w:sz="1"/>
+              <w:right w:val="single" w:color="CCCCCC" w:sz="1"/>
+            </w:tcBorders>
+            <w:tcMar>
+              <w:top w:type="dxa" w:w="80"/>
+              <w:left w:type="dxa" w:w="120"/>
+              <w:bottom w:type="dxa" w:w="80"/>
+              <w:right w:type="dxa" w:w="120"/>
+            </w:tcMar>
+          </w:tcPr>
+          <w:p>
+            <w:r>
+              <w:rPr>
+                <w:rFonts w:ascii="Arial" w:cs="Arial" w:eastAsia="Arial" w:hAnsi="Arial"/>
+                <w:sz w:val="20"/>
+                <w:szCs w:val="20"/>
+              </w:rPr>
+              <w:t xml:space="preserve">Scan Folders…</w:t>
+            </w:r>
+          </w:p>
+        </w:tc>
+        <w:tc>
+          <w:tcPr>
+            <w:tcW w:type="dxa" w:w="1400"/>
+            <w:tcBorders>
+              <w:top w:val="single" w:color="CCCCCC" w:sz="1"/>
+              <w:left w:val="single" w:color="CCCCCC" w:sz="1"/>
+              <w:bottom w:val="single" w:color="CCCCCC" w:sz="1"/>
+              <w:right w:val="single" w:color="CCCCCC" w:sz="1"/>
+            </w:tcBorders>
+            <w:tcMar>
+              <w:top w:type="dxa" w:w="80"/>
+              <w:left w:type="dxa" w:w="120"/>
+              <w:bottom w:type="dxa" w:w="80"/>
+              <w:right w:type="dxa" w:w="120"/>
+            </w:tcMar>
+          </w:tcPr>
+          <w:p>
+            <w:r>
+              <w:rPr>
+                <w:rFonts w:ascii="Arial" w:cs="Arial" w:eastAsia="Arial" w:hAnsi="Arial"/>
+                <w:sz w:val="20"/>
+                <w:szCs w:val="20"/>
+              </w:rPr>
+              <w:t xml:space="preserve"/>
+            </w:r>
+          </w:p>
+        </w:tc>
+        <w:tc>
+          <w:tcPr>
+            <w:tcW w:type="dxa" w:w="5560"/>
+            <w:tcBorders>
+              <w:top w:val="single" w:color="CCCCCC" w:sz="1"/>
+              <w:left w:val="single" w:color="CCCCCC" w:sz="1"/>
+              <w:bottom w:val="single" w:color="CCCCCC" w:sz="1"/>
+              <w:right w:val="single" w:color="CCCCCC" w:sz="1"/>
+            </w:tcBorders>
+            <w:tcMar>
+              <w:top w:type="dxa" w:w="80"/>
+              <w:left w:type="dxa" w:w="120"/>
+              <w:bottom w:type="dxa" w:w="80"/>
+              <w:right w:type="dxa" w:w="120"/>
+            </w:tcMar>
+          </w:tcPr>
+          <w:p>
+            <w:r>
+              <w:rPr>
+                <w:rFonts w:ascii="Arial" w:cs="Arial" w:eastAsia="Arial" w:hAnsi="Arial"/>
+                <w:sz w:val="20"/>
+                <w:szCs w:val="20"/>
+              </w:rPr>
+              <w:t xml:space="preserve">Add multiple folders to a queue (one at a time, with previews) and scan them in batch. Each folder produces its own report.</w:t>
+            </w:r>
+          </w:p>
+        </w:tc>
+      </w:tr>
+      <w:tr>
+        <w:tc>
+          <w:tcPr>
+            <w:tcW w:type="dxa" w:w="2400"/>
+            <w:tcBorders>
+              <w:top w:val="single" w:color="CCCCCC" w:sz="1"/>
+              <w:left w:val="single" w:color="CCCCCC" w:sz="1"/>
+              <w:bottom w:val="single" w:color="CCCCCC" w:sz="1"/>
+              <w:right w:val="single" w:color="CCCCCC" w:sz="1"/>
+            </w:tcBorders>
+            <w:tcMar>
+              <w:top w:type="dxa" w:w="80"/>
+              <w:left w:type="dxa" w:w="120"/>
+              <w:bottom w:type="dxa" w:w="80"/>
+              <w:right w:type="dxa" w:w="120"/>
+            </w:tcMar>
+          </w:tcPr>
+          <w:p>
+            <w:r>
+              <w:rPr>
+                <w:rFonts w:ascii="Arial" w:cs="Arial" w:eastAsia="Arial" w:hAnsi="Arial"/>
+                <w:sz w:val="20"/>
+                <w:szCs w:val="20"/>
+              </w:rPr>
+              <w:t xml:space="preserve">Scan All Runs…</w:t>
+            </w:r>
+          </w:p>
+        </w:tc>
+        <w:tc>
+          <w:tcPr>
+            <w:tcW w:type="dxa" w:w="1400"/>
+            <w:tcBorders>
+              <w:top w:val="single" w:color="CCCCCC" w:sz="1"/>
+              <w:left w:val="single" w:color="CCCCCC" w:sz="1"/>
+              <w:bottom w:val="single" w:color="CCCCCC" w:sz="1"/>
+              <w:right w:val="single" w:color="CCCCCC" w:sz="1"/>
+            </w:tcBorders>
+            <w:tcMar>
+              <w:top w:type="dxa" w:w="80"/>
+              <w:left w:type="dxa" w:w="120"/>
+              <w:bottom w:type="dxa" w:w="80"/>
+              <w:right w:type="dxa" w:w="120"/>
+            </w:tcMar>
+          </w:tcPr>
+          <w:p>
+            <w:r>
+              <w:rPr>
+                <w:rFonts w:ascii="Arial" w:cs="Arial" w:eastAsia="Arial" w:hAnsi="Arial"/>
+                <w:sz w:val="20"/>
+                <w:szCs w:val="20"/>
+              </w:rPr>
+              <w:t xml:space="preserve"/>
+            </w:r>
+          </w:p>
+        </w:tc>
+        <w:tc>
+          <w:tcPr>
+            <w:tcW w:type="dxa" w:w="5560"/>
+            <w:tcBorders>
+              <w:top w:val="single" w:color="CCCCCC" w:sz="1"/>
+              <w:left w:val="single" w:color="CCCCCC" w:sz="1"/>
+              <w:bottom w:val="single" w:color="CCCCCC" w:sz="1"/>
+              <w:right w:val="single" w:color="CCCCCC" w:sz="1"/>
+            </w:tcBorders>
+            <w:tcMar>
+              <w:top w:type="dxa" w:w="80"/>
+              <w:left w:type="dxa" w:w="120"/>
+              <w:bottom w:type="dxa" w:w="80"/>
+              <w:right w:type="dxa" w:w="120"/>
+            </w:tcMar>
+          </w:tcPr>
+          <w:p>
+            <w:r>
+              <w:rPr>
+                <w:rFonts w:ascii="Arial" w:cs="Arial" w:eastAsia="Arial" w:hAnsi="Arial"/>
+                <w:sz w:val="20"/>
+                <w:szCs w:val="20"/>
+              </w:rPr>
+              <w:t xml:space="preserve">Pick a single root directory; the app recursively finds every subfolder containing *Baseline*.tdd files. A preview dialog lets you remove rows before scanning.</w:t>
+            </w:r>
+          </w:p>
+        </w:tc>
+      </w:tr>
+      <w:tr>
+        <w:tc>
+          <w:tcPr>
+            <w:tcW w:type="dxa" w:w="2400"/>
+            <w:tcBorders>
+              <w:top w:val="single" w:color="CCCCCC" w:sz="1"/>
+              <w:left w:val="single" w:color="CCCCCC" w:sz="1"/>
+              <w:bottom w:val="single" w:color="CCCCCC" w:sz="1"/>
+              <w:right w:val="single" w:color="CCCCCC" w:sz="1"/>
+            </w:tcBorders>
+            <w:tcMar>
+              <w:top w:type="dxa" w:w="80"/>
+              <w:left w:type="dxa" w:w="120"/>
+              <w:bottom w:type="dxa" w:w="80"/>
+              <w:right w:type="dxa" w:w="120"/>
+            </w:tcMar>
+          </w:tcPr>
+          <w:p>
+            <w:r>
+              <w:rPr>
+                <w:rFonts w:ascii="Arial" w:cs="Arial" w:eastAsia="Arial" w:hAnsi="Arial"/>
+                <w:sz w:val="20"/>
+                <w:szCs w:val="20"/>
+              </w:rPr>
               <w:t xml:space="preserve">Exit</w:t>
             </w:r>
           </w:p>
@@ -696,7 +1066,7 @@
                 <w:sz w:val="20"/>
                 <w:szCs w:val="20"/>
               </w:rPr>
-              <w:t xml:space="preserve">Close the application.</w:t>
+              <w:t xml:space="preserve">Close the application. Settings are saved on every parameter change, so nothing is lost.</w:t>
             </w:r>
           </w:p>
         </w:tc>
@@ -707,7 +1077,7 @@
         <w:pStyle w:val="Heading2"/>
       </w:pPr>
       <w:r>
-        <w:t xml:space="preserve">3.2 Toolbar (Top Bar)</w:t>
+        <w:t xml:space="preserve">3.2 Toolbar</w:t>
       </w:r>
     </w:p>
     <w:p>
@@ -720,7 +1090,7 @@
           <w:sz w:val="22"/>
           <w:szCs w:val="22"/>
         </w:rPr>
-        <w:t xml:space="preserve">The toolbar displays the loaded file information and detection parameters:</w:t>
+        <w:t xml:space="preserve">All toolbar values persist between sessions (saved to step_noise_finder_config.json next to the app) and are applied when you click Scan All Channels or any of the menu commands.</w:t>
       </w:r>
     </w:p>
     <w:tbl>
@@ -736,14 +1106,14 @@
         </w:tblBorders>
       </w:tblPr>
       <w:tblGrid>
-        <w:gridCol w:w="2000"/>
+        <w:gridCol w:w="2200"/>
         <w:gridCol w:w="1200"/>
-        <w:gridCol w:w="6160"/>
+        <w:gridCol w:w="5960"/>
       </w:tblGrid>
       <w:tr>
         <w:tc>
           <w:tcPr>
-            <w:tcW w:type="dxa" w:w="2000"/>
+            <w:tcW w:type="dxa" w:w="2200"/>
             <w:tcBorders>
               <w:top w:val="single" w:color="CCCCCC" w:sz="1"/>
               <w:left w:val="single" w:color="CCCCCC" w:sz="1"/>
@@ -805,7 +1175,7 @@
         </w:tc>
         <w:tc>
           <w:tcPr>
-            <w:tcW w:type="dxa" w:w="6160"/>
+            <w:tcW w:type="dxa" w:w="5960"/>
             <w:tcBorders>
               <w:top w:val="single" w:color="CCCCCC" w:sz="1"/>
               <w:left w:val="single" w:color="CCCCCC" w:sz="1"/>
@@ -838,7 +1208,7 @@
       <w:tr>
         <w:tc>
           <w:tcPr>
-            <w:tcW w:type="dxa" w:w="2000"/>
+            <w:tcW w:type="dxa" w:w="2200"/>
             <w:tcBorders>
               <w:top w:val="single" w:color="CCCCCC" w:sz="1"/>
               <w:left w:val="single" w:color="CCCCCC" w:sz="1"/>
@@ -892,28 +1262,28 @@
         </w:tc>
         <w:tc>
           <w:tcPr>
-            <w:tcW w:type="dxa" w:w="6160"/>
-            <w:tcBorders>
-              <w:top w:val="single" w:color="CCCCCC" w:sz="1"/>
-              <w:left w:val="single" w:color="CCCCCC" w:sz="1"/>
-              <w:bottom w:val="single" w:color="CCCCCC" w:sz="1"/>
-              <w:right w:val="single" w:color="CCCCCC" w:sz="1"/>
-            </w:tcBorders>
-            <w:tcMar>
-              <w:top w:type="dxa" w:w="80"/>
-              <w:left w:type="dxa" w:w="120"/>
-              <w:bottom w:type="dxa" w:w="80"/>
-              <w:right w:type="dxa" w:w="120"/>
-            </w:tcMar>
-          </w:tcPr>
-          <w:p>
-            <w:r>
-              <w:rPr>
-                <w:rFonts w:ascii="Arial" w:cs="Arial" w:eastAsia="Arial" w:hAnsi="Arial"/>
-                <w:sz w:val="20"/>
-                <w:szCs w:val="20"/>
-              </w:rPr>
-              <w:t xml:space="preserve">Displays the loaded filename (truncated before the first underscore), channel count, sample rate, and duration.</w:t>
+            <w:tcW w:type="dxa" w:w="5960"/>
+            <w:tcBorders>
+              <w:top w:val="single" w:color="CCCCCC" w:sz="1"/>
+              <w:left w:val="single" w:color="CCCCCC" w:sz="1"/>
+              <w:bottom w:val="single" w:color="CCCCCC" w:sz="1"/>
+              <w:right w:val="single" w:color="CCCCCC" w:sz="1"/>
+            </w:tcBorders>
+            <w:tcMar>
+              <w:top w:type="dxa" w:w="80"/>
+              <w:left w:type="dxa" w:w="120"/>
+              <w:bottom w:type="dxa" w:w="80"/>
+              <w:right w:type="dxa" w:w="120"/>
+            </w:tcMar>
+          </w:tcPr>
+          <w:p>
+            <w:r>
+              <w:rPr>
+                <w:rFonts w:ascii="Arial" w:cs="Arial" w:eastAsia="Arial" w:hAnsi="Arial"/>
+                <w:sz w:val="20"/>
+                <w:szCs w:val="20"/>
+              </w:rPr>
+              <w:t xml:space="preserve">Loaded file or batch label (filename truncated before the first underscore for readability).</w:t>
             </w:r>
           </w:p>
         </w:tc>
@@ -921,7 +1291,7 @@
       <w:tr>
         <w:tc>
           <w:tcPr>
-            <w:tcW w:type="dxa" w:w="2000"/>
+            <w:tcW w:type="dxa" w:w="2200"/>
             <w:tcBorders>
               <w:top w:val="single" w:color="CCCCCC" w:sz="1"/>
               <w:left w:val="single" w:color="CCCCCC" w:sz="1"/>
@@ -969,34 +1339,34 @@
                 <w:sz w:val="20"/>
                 <w:szCs w:val="20"/>
               </w:rPr>
-              <w:t xml:space="preserve">100.0</w:t>
-            </w:r>
-          </w:p>
-        </w:tc>
-        <w:tc>
-          <w:tcPr>
-            <w:tcW w:type="dxa" w:w="6160"/>
-            <w:tcBorders>
-              <w:top w:val="single" w:color="CCCCCC" w:sz="1"/>
-              <w:left w:val="single" w:color="CCCCCC" w:sz="1"/>
-              <w:bottom w:val="single" w:color="CCCCCC" w:sz="1"/>
-              <w:right w:val="single" w:color="CCCCCC" w:sz="1"/>
-            </w:tcBorders>
-            <w:tcMar>
-              <w:top w:type="dxa" w:w="80"/>
-              <w:left w:type="dxa" w:w="120"/>
-              <w:bottom w:type="dxa" w:w="80"/>
-              <w:right w:type="dxa" w:w="120"/>
-            </w:tcMar>
-          </w:tcPr>
-          <w:p>
-            <w:r>
-              <w:rPr>
-                <w:rFonts w:ascii="Arial" w:cs="Arial" w:eastAsia="Arial" w:hAnsi="Arial"/>
-                <w:sz w:val="20"/>
-                <w:szCs w:val="20"/>
-              </w:rPr>
-              <w:t xml:space="preserve">Minimum peak-to-peak amplitude of the bandpass-filtered signal (in millivolts) required to flag a window as containing step noise.</w:t>
+              <w:t xml:space="preserve">100</w:t>
+            </w:r>
+          </w:p>
+        </w:tc>
+        <w:tc>
+          <w:tcPr>
+            <w:tcW w:type="dxa" w:w="5960"/>
+            <w:tcBorders>
+              <w:top w:val="single" w:color="CCCCCC" w:sz="1"/>
+              <w:left w:val="single" w:color="CCCCCC" w:sz="1"/>
+              <w:bottom w:val="single" w:color="CCCCCC" w:sz="1"/>
+              <w:right w:val="single" w:color="CCCCCC" w:sz="1"/>
+            </w:tcBorders>
+            <w:tcMar>
+              <w:top w:type="dxa" w:w="80"/>
+              <w:left w:type="dxa" w:w="120"/>
+              <w:bottom w:type="dxa" w:w="80"/>
+              <w:right w:type="dxa" w:w="120"/>
+            </w:tcMar>
+          </w:tcPr>
+          <w:p>
+            <w:r>
+              <w:rPr>
+                <w:rFonts w:ascii="Arial" w:cs="Arial" w:eastAsia="Arial" w:hAnsi="Arial"/>
+                <w:sz w:val="20"/>
+                <w:szCs w:val="20"/>
+              </w:rPr>
+              <w:t xml:space="preserve">Minimum peak-to-peak amplitude of the bandpass signal in a 10 s window for the window to qualify.</w:t>
             </w:r>
           </w:p>
         </w:tc>
@@ -1004,7 +1374,7 @@
       <w:tr>
         <w:tc>
           <w:tcPr>
-            <w:tcW w:type="dxa" w:w="2000"/>
+            <w:tcW w:type="dxa" w:w="2200"/>
             <w:tcBorders>
               <w:top w:val="single" w:color="CCCCCC" w:sz="1"/>
               <w:left w:val="single" w:color="CCCCCC" w:sz="1"/>
@@ -1058,28 +1428,28 @@
         </w:tc>
         <w:tc>
           <w:tcPr>
-            <w:tcW w:type="dxa" w:w="6160"/>
-            <w:tcBorders>
-              <w:top w:val="single" w:color="CCCCCC" w:sz="1"/>
-              <w:left w:val="single" w:color="CCCCCC" w:sz="1"/>
-              <w:bottom w:val="single" w:color="CCCCCC" w:sz="1"/>
-              <w:right w:val="single" w:color="CCCCCC" w:sz="1"/>
-            </w:tcBorders>
-            <w:tcMar>
-              <w:top w:type="dxa" w:w="80"/>
-              <w:left w:type="dxa" w:w="120"/>
-              <w:bottom w:type="dxa" w:w="80"/>
-              <w:right w:type="dxa" w:w="120"/>
-            </w:tcMar>
-          </w:tcPr>
-          <w:p>
-            <w:r>
-              <w:rPr>
-                <w:rFonts w:ascii="Arial" w:cs="Arial" w:eastAsia="Arial" w:hAnsi="Arial"/>
-                <w:sz w:val="20"/>
-                <w:szCs w:val="20"/>
-              </w:rPr>
-              <w:t xml:space="preserve">Frequency range for the step noise search. The bandpass filter and autocorrelation lag range are derived from these values.</w:t>
+            <w:tcW w:type="dxa" w:w="5960"/>
+            <w:tcBorders>
+              <w:top w:val="single" w:color="CCCCCC" w:sz="1"/>
+              <w:left w:val="single" w:color="CCCCCC" w:sz="1"/>
+              <w:bottom w:val="single" w:color="CCCCCC" w:sz="1"/>
+              <w:right w:val="single" w:color="CCCCCC" w:sz="1"/>
+            </w:tcBorders>
+            <w:tcMar>
+              <w:top w:type="dxa" w:w="80"/>
+              <w:left w:type="dxa" w:w="120"/>
+              <w:bottom w:type="dxa" w:w="80"/>
+              <w:right w:type="dxa" w:w="120"/>
+            </w:tcMar>
+          </w:tcPr>
+          <w:p>
+            <w:r>
+              <w:rPr>
+                <w:rFonts w:ascii="Arial" w:cs="Arial" w:eastAsia="Arial" w:hAnsi="Arial"/>
+                <w:sz w:val="20"/>
+                <w:szCs w:val="20"/>
+              </w:rPr>
+              <w:t xml:space="preserve">Frequency band of interest. Sets the bandpass filter and the autocorrelation lag-search range.</w:t>
             </w:r>
           </w:p>
         </w:tc>
@@ -1087,7 +1457,7 @@
       <w:tr>
         <w:tc>
           <w:tcPr>
-            <w:tcW w:type="dxa" w:w="2000"/>
+            <w:tcW w:type="dxa" w:w="2200"/>
             <w:tcBorders>
               <w:top w:val="single" w:color="CCCCCC" w:sz="1"/>
               <w:left w:val="single" w:color="CCCCCC" w:sz="1"/>
@@ -1135,34 +1505,34 @@
                 <w:sz w:val="20"/>
                 <w:szCs w:val="20"/>
               </w:rPr>
-              <w:t xml:space="preserve">0.40</w:t>
-            </w:r>
-          </w:p>
-        </w:tc>
-        <w:tc>
-          <w:tcPr>
-            <w:tcW w:type="dxa" w:w="6160"/>
-            <w:tcBorders>
-              <w:top w:val="single" w:color="CCCCCC" w:sz="1"/>
-              <w:left w:val="single" w:color="CCCCCC" w:sz="1"/>
-              <w:bottom w:val="single" w:color="CCCCCC" w:sz="1"/>
-              <w:right w:val="single" w:color="CCCCCC" w:sz="1"/>
-            </w:tcBorders>
-            <w:tcMar>
-              <w:top w:type="dxa" w:w="80"/>
-              <w:left w:type="dxa" w:w="120"/>
-              <w:bottom w:type="dxa" w:w="80"/>
-              <w:right w:type="dxa" w:w="120"/>
-            </w:tcMar>
-          </w:tcPr>
-          <w:p>
-            <w:r>
-              <w:rPr>
-                <w:rFonts w:ascii="Arial" w:cs="Arial" w:eastAsia="Arial" w:hAnsi="Arial"/>
-                <w:sz w:val="20"/>
-                <w:szCs w:val="20"/>
-              </w:rPr>
-              <w:t xml:space="preserve">Minimum autocorrelation score (0–1). Higher values require more regular periodicity. A value of 0.4 reliably separates step noise from random fluctuations.</w:t>
+              <w:t xml:space="preserve">0.20</w:t>
+            </w:r>
+          </w:p>
+        </w:tc>
+        <w:tc>
+          <w:tcPr>
+            <w:tcW w:type="dxa" w:w="5960"/>
+            <w:tcBorders>
+              <w:top w:val="single" w:color="CCCCCC" w:sz="1"/>
+              <w:left w:val="single" w:color="CCCCCC" w:sz="1"/>
+              <w:bottom w:val="single" w:color="CCCCCC" w:sz="1"/>
+              <w:right w:val="single" w:color="CCCCCC" w:sz="1"/>
+            </w:tcBorders>
+            <w:tcMar>
+              <w:top w:type="dxa" w:w="80"/>
+              <w:left w:type="dxa" w:w="120"/>
+              <w:bottom w:type="dxa" w:w="80"/>
+              <w:right w:type="dxa" w:w="120"/>
+            </w:tcMar>
+          </w:tcPr>
+          <w:p>
+            <w:r>
+              <w:rPr>
+                <w:rFonts w:ascii="Arial" w:cs="Arial" w:eastAsia="Arial" w:hAnsi="Arial"/>
+                <w:sz w:val="20"/>
+                <w:szCs w:val="20"/>
+              </w:rPr>
+              <w:t xml:space="preserve">Minimum normalized autocorrelation peak (0–1) in periodic mode. Ignored in envelope mode.</w:t>
             </w:r>
           </w:p>
         </w:tc>
@@ -1170,28 +1540,28 @@
       <w:tr>
         <w:tc>
           <w:tcPr>
-            <w:tcW w:type="dxa" w:w="2000"/>
-            <w:tcBorders>
-              <w:top w:val="single" w:color="CCCCCC" w:sz="1"/>
-              <w:left w:val="single" w:color="CCCCCC" w:sz="1"/>
-              <w:bottom w:val="single" w:color="CCCCCC" w:sz="1"/>
-              <w:right w:val="single" w:color="CCCCCC" w:sz="1"/>
-            </w:tcBorders>
-            <w:tcMar>
-              <w:top w:type="dxa" w:w="80"/>
-              <w:left w:type="dxa" w:w="120"/>
-              <w:bottom w:type="dxa" w:w="80"/>
-              <w:right w:type="dxa" w:w="120"/>
-            </w:tcMar>
-          </w:tcPr>
-          <w:p>
-            <w:r>
-              <w:rPr>
-                <w:rFonts w:ascii="Arial" w:cs="Arial" w:eastAsia="Arial" w:hAnsi="Arial"/>
-                <w:sz w:val="20"/>
-                <w:szCs w:val="20"/>
-              </w:rPr>
-              <w:t xml:space="preserve">Scan All Channels</w:t>
+            <w:tcW w:type="dxa" w:w="2200"/>
+            <w:tcBorders>
+              <w:top w:val="single" w:color="CCCCCC" w:sz="1"/>
+              <w:left w:val="single" w:color="CCCCCC" w:sz="1"/>
+              <w:bottom w:val="single" w:color="CCCCCC" w:sz="1"/>
+              <w:right w:val="single" w:color="CCCCCC" w:sz="1"/>
+            </w:tcBorders>
+            <w:tcMar>
+              <w:top w:type="dxa" w:w="80"/>
+              <w:left w:type="dxa" w:w="120"/>
+              <w:bottom w:type="dxa" w:w="80"/>
+              <w:right w:type="dxa" w:w="120"/>
+            </w:tcMar>
+          </w:tcPr>
+          <w:p>
+            <w:r>
+              <w:rPr>
+                <w:rFonts w:ascii="Arial" w:cs="Arial" w:eastAsia="Arial" w:hAnsi="Arial"/>
+                <w:sz w:val="20"/>
+                <w:szCs w:val="20"/>
+              </w:rPr>
+              <w:t xml:space="preserve">Gap (s)</w:t>
             </w:r>
           </w:p>
         </w:tc>
@@ -1218,34 +1588,34 @@
                 <w:sz w:val="20"/>
                 <w:szCs w:val="20"/>
               </w:rPr>
-              <w:t xml:space="preserve">—</w:t>
-            </w:r>
-          </w:p>
-        </w:tc>
-        <w:tc>
-          <w:tcPr>
-            <w:tcW w:type="dxa" w:w="6160"/>
-            <w:tcBorders>
-              <w:top w:val="single" w:color="CCCCCC" w:sz="1"/>
-              <w:left w:val="single" w:color="CCCCCC" w:sz="1"/>
-              <w:bottom w:val="single" w:color="CCCCCC" w:sz="1"/>
-              <w:right w:val="single" w:color="CCCCCC" w:sz="1"/>
-            </w:tcBorders>
-            <w:tcMar>
-              <w:top w:type="dxa" w:w="80"/>
-              <w:left w:type="dxa" w:w="120"/>
-              <w:bottom w:type="dxa" w:w="80"/>
-              <w:right w:type="dxa" w:w="120"/>
-            </w:tcMar>
-          </w:tcPr>
-          <w:p>
-            <w:r>
-              <w:rPr>
-                <w:rFonts w:ascii="Arial" w:cs="Arial" w:eastAsia="Arial" w:hAnsi="Arial"/>
-                <w:sz w:val="20"/>
-                <w:szCs w:val="20"/>
-              </w:rPr>
-              <w:t xml:space="preserve">Scans all channels in the currently loaded single file. Enabled after Open TDD.</w:t>
+              <w:t xml:space="preserve">30</w:t>
+            </w:r>
+          </w:p>
+        </w:tc>
+        <w:tc>
+          <w:tcPr>
+            <w:tcW w:type="dxa" w:w="5960"/>
+            <w:tcBorders>
+              <w:top w:val="single" w:color="CCCCCC" w:sz="1"/>
+              <w:left w:val="single" w:color="CCCCCC" w:sz="1"/>
+              <w:bottom w:val="single" w:color="CCCCCC" w:sz="1"/>
+              <w:right w:val="single" w:color="CCCCCC" w:sz="1"/>
+            </w:tcBorders>
+            <w:tcMar>
+              <w:top w:type="dxa" w:w="80"/>
+              <w:left w:type="dxa" w:w="120"/>
+              <w:bottom w:type="dxa" w:w="80"/>
+              <w:right w:type="dxa" w:w="120"/>
+            </w:tcMar>
+          </w:tcPr>
+          <w:p>
+            <w:r>
+              <w:rPr>
+                <w:rFonts w:ascii="Arial" w:cs="Arial" w:eastAsia="Arial" w:hAnsi="Arial"/>
+                <w:sz w:val="20"/>
+                <w:szCs w:val="20"/>
+              </w:rPr>
+              <w:t xml:space="preserve">Maximum gap between qualifying windows that will still be merged into one event. Bump above ~180 s to merge across consecutive files.</w:t>
             </w:r>
           </w:p>
         </w:tc>
@@ -1253,7 +1623,173 @@
       <w:tr>
         <w:tc>
           <w:tcPr>
-            <w:tcW w:type="dxa" w:w="2000"/>
+            <w:tcW w:type="dxa" w:w="2200"/>
+            <w:tcBorders>
+              <w:top w:val="single" w:color="CCCCCC" w:sz="1"/>
+              <w:left w:val="single" w:color="CCCCCC" w:sz="1"/>
+              <w:bottom w:val="single" w:color="CCCCCC" w:sz="1"/>
+              <w:right w:val="single" w:color="CCCCCC" w:sz="1"/>
+            </w:tcBorders>
+            <w:tcMar>
+              <w:top w:type="dxa" w:w="80"/>
+              <w:left w:type="dxa" w:w="120"/>
+              <w:bottom w:type="dxa" w:w="80"/>
+              <w:right w:type="dxa" w:w="120"/>
+            </w:tcMar>
+          </w:tcPr>
+          <w:p>
+            <w:r>
+              <w:rPr>
+                <w:rFonts w:ascii="Arial" w:cs="Arial" w:eastAsia="Arial" w:hAnsi="Arial"/>
+                <w:sz w:val="20"/>
+                <w:szCs w:val="20"/>
+              </w:rPr>
+              <w:t xml:space="preserve">Envelope mode</w:t>
+            </w:r>
+          </w:p>
+        </w:tc>
+        <w:tc>
+          <w:tcPr>
+            <w:tcW w:type="dxa" w:w="1200"/>
+            <w:tcBorders>
+              <w:top w:val="single" w:color="CCCCCC" w:sz="1"/>
+              <w:left w:val="single" w:color="CCCCCC" w:sz="1"/>
+              <w:bottom w:val="single" w:color="CCCCCC" w:sz="1"/>
+              <w:right w:val="single" w:color="CCCCCC" w:sz="1"/>
+            </w:tcBorders>
+            <w:tcMar>
+              <w:top w:type="dxa" w:w="80"/>
+              <w:left w:type="dxa" w:w="120"/>
+              <w:bottom w:type="dxa" w:w="80"/>
+              <w:right w:type="dxa" w:w="120"/>
+            </w:tcMar>
+          </w:tcPr>
+          <w:p>
+            <w:r>
+              <w:rPr>
+                <w:rFonts w:ascii="Arial" w:cs="Arial" w:eastAsia="Arial" w:hAnsi="Arial"/>
+                <w:sz w:val="20"/>
+                <w:szCs w:val="20"/>
+              </w:rPr>
+              <w:t xml:space="preserve">off</w:t>
+            </w:r>
+          </w:p>
+        </w:tc>
+        <w:tc>
+          <w:tcPr>
+            <w:tcW w:type="dxa" w:w="5960"/>
+            <w:tcBorders>
+              <w:top w:val="single" w:color="CCCCCC" w:sz="1"/>
+              <w:left w:val="single" w:color="CCCCCC" w:sz="1"/>
+              <w:bottom w:val="single" w:color="CCCCCC" w:sz="1"/>
+              <w:right w:val="single" w:color="CCCCCC" w:sz="1"/>
+            </w:tcBorders>
+            <w:tcMar>
+              <w:top w:type="dxa" w:w="80"/>
+              <w:left w:type="dxa" w:w="120"/>
+              <w:bottom w:type="dxa" w:w="80"/>
+              <w:right w:type="dxa" w:w="120"/>
+            </w:tcMar>
+          </w:tcPr>
+          <w:p>
+            <w:r>
+              <w:rPr>
+                <w:rFonts w:ascii="Arial" w:cs="Arial" w:eastAsia="Arial" w:hAnsi="Arial"/>
+                <w:sz w:val="20"/>
+                <w:szCs w:val="20"/>
+              </w:rPr>
+              <w:t xml:space="preserve">When checked, the autocorrelation gates are bypassed. Detection only requires bandpass amplitude and ≥10 peaks per 10 s window.</w:t>
+            </w:r>
+          </w:p>
+        </w:tc>
+      </w:tr>
+      <w:tr>
+        <w:tc>
+          <w:tcPr>
+            <w:tcW w:type="dxa" w:w="2200"/>
+            <w:tcBorders>
+              <w:top w:val="single" w:color="CCCCCC" w:sz="1"/>
+              <w:left w:val="single" w:color="CCCCCC" w:sz="1"/>
+              <w:bottom w:val="single" w:color="CCCCCC" w:sz="1"/>
+              <w:right w:val="single" w:color="CCCCCC" w:sz="1"/>
+            </w:tcBorders>
+            <w:tcMar>
+              <w:top w:type="dxa" w:w="80"/>
+              <w:left w:type="dxa" w:w="120"/>
+              <w:bottom w:type="dxa" w:w="80"/>
+              <w:right w:type="dxa" w:w="120"/>
+            </w:tcMar>
+          </w:tcPr>
+          <w:p>
+            <w:r>
+              <w:rPr>
+                <w:rFonts w:ascii="Arial" w:cs="Arial" w:eastAsia="Arial" w:hAnsi="Arial"/>
+                <w:sz w:val="20"/>
+                <w:szCs w:val="20"/>
+              </w:rPr>
+              <w:t xml:space="preserve">Scan All Channels</w:t>
+            </w:r>
+          </w:p>
+        </w:tc>
+        <w:tc>
+          <w:tcPr>
+            <w:tcW w:type="dxa" w:w="1200"/>
+            <w:tcBorders>
+              <w:top w:val="single" w:color="CCCCCC" w:sz="1"/>
+              <w:left w:val="single" w:color="CCCCCC" w:sz="1"/>
+              <w:bottom w:val="single" w:color="CCCCCC" w:sz="1"/>
+              <w:right w:val="single" w:color="CCCCCC" w:sz="1"/>
+            </w:tcBorders>
+            <w:tcMar>
+              <w:top w:type="dxa" w:w="80"/>
+              <w:left w:type="dxa" w:w="120"/>
+              <w:bottom w:type="dxa" w:w="80"/>
+              <w:right w:type="dxa" w:w="120"/>
+            </w:tcMar>
+          </w:tcPr>
+          <w:p>
+            <w:r>
+              <w:rPr>
+                <w:rFonts w:ascii="Arial" w:cs="Arial" w:eastAsia="Arial" w:hAnsi="Arial"/>
+                <w:sz w:val="20"/>
+                <w:szCs w:val="20"/>
+              </w:rPr>
+              <w:t xml:space="preserve">—</w:t>
+            </w:r>
+          </w:p>
+        </w:tc>
+        <w:tc>
+          <w:tcPr>
+            <w:tcW w:type="dxa" w:w="5960"/>
+            <w:tcBorders>
+              <w:top w:val="single" w:color="CCCCCC" w:sz="1"/>
+              <w:left w:val="single" w:color="CCCCCC" w:sz="1"/>
+              <w:bottom w:val="single" w:color="CCCCCC" w:sz="1"/>
+              <w:right w:val="single" w:color="CCCCCC" w:sz="1"/>
+            </w:tcBorders>
+            <w:tcMar>
+              <w:top w:type="dxa" w:w="80"/>
+              <w:left w:type="dxa" w:w="120"/>
+              <w:bottom w:type="dxa" w:w="80"/>
+              <w:right w:type="dxa" w:w="120"/>
+            </w:tcMar>
+          </w:tcPr>
+          <w:p>
+            <w:r>
+              <w:rPr>
+                <w:rFonts w:ascii="Arial" w:cs="Arial" w:eastAsia="Arial" w:hAnsi="Arial"/>
+                <w:sz w:val="20"/>
+                <w:szCs w:val="20"/>
+              </w:rPr>
+              <w:t xml:space="preserve">Run detection. After the first scan, this button stays enabled — tweak parameters and click again to rescan the same target.</w:t>
+            </w:r>
+          </w:p>
+        </w:tc>
+      </w:tr>
+      <w:tr>
+        <w:tc>
+          <w:tcPr>
+            <w:tcW w:type="dxa" w:w="2200"/>
             <w:tcBorders>
               <w:top w:val="single" w:color="CCCCCC" w:sz="1"/>
               <w:left w:val="single" w:color="CCCCCC" w:sz="1"/>
@@ -1307,28 +1843,111 @@
         </w:tc>
         <w:tc>
           <w:tcPr>
-            <w:tcW w:type="dxa" w:w="6160"/>
-            <w:tcBorders>
-              <w:top w:val="single" w:color="CCCCCC" w:sz="1"/>
-              <w:left w:val="single" w:color="CCCCCC" w:sz="1"/>
-              <w:bottom w:val="single" w:color="CCCCCC" w:sz="1"/>
-              <w:right w:val="single" w:color="CCCCCC" w:sz="1"/>
-            </w:tcBorders>
-            <w:tcMar>
-              <w:top w:type="dxa" w:w="80"/>
-              <w:left w:type="dxa" w:w="120"/>
-              <w:bottom w:type="dxa" w:w="80"/>
-              <w:right w:type="dxa" w:w="120"/>
-            </w:tcMar>
-          </w:tcPr>
-          <w:p>
-            <w:r>
-              <w:rPr>
-                <w:rFonts w:ascii="Arial" w:cs="Arial" w:eastAsia="Arial" w:hAnsi="Arial"/>
-                <w:sz w:val="20"/>
-                <w:szCs w:val="20"/>
-              </w:rPr>
-              <w:t xml:space="preserve">Opens a file picker to select multiple baseline TDD files for batch scanning.</w:t>
+            <w:tcW w:type="dxa" w:w="5960"/>
+            <w:tcBorders>
+              <w:top w:val="single" w:color="CCCCCC" w:sz="1"/>
+              <w:left w:val="single" w:color="CCCCCC" w:sz="1"/>
+              <w:bottom w:val="single" w:color="CCCCCC" w:sz="1"/>
+              <w:right w:val="single" w:color="CCCCCC" w:sz="1"/>
+            </w:tcBorders>
+            <w:tcMar>
+              <w:top w:type="dxa" w:w="80"/>
+              <w:left w:type="dxa" w:w="120"/>
+              <w:bottom w:type="dxa" w:w="80"/>
+              <w:right w:type="dxa" w:w="120"/>
+            </w:tcMar>
+          </w:tcPr>
+          <w:p>
+            <w:r>
+              <w:rPr>
+                <w:rFonts w:ascii="Arial" w:cs="Arial" w:eastAsia="Arial" w:hAnsi="Arial"/>
+                <w:sz w:val="20"/>
+                <w:szCs w:val="20"/>
+              </w:rPr>
+              <w:t xml:space="preserve">Same as the menu item; opens the folder picker.</w:t>
+            </w:r>
+          </w:p>
+        </w:tc>
+      </w:tr>
+      <w:tr>
+        <w:tc>
+          <w:tcPr>
+            <w:tcW w:type="dxa" w:w="2200"/>
+            <w:tcBorders>
+              <w:top w:val="single" w:color="CCCCCC" w:sz="1"/>
+              <w:left w:val="single" w:color="CCCCCC" w:sz="1"/>
+              <w:bottom w:val="single" w:color="CCCCCC" w:sz="1"/>
+              <w:right w:val="single" w:color="CCCCCC" w:sz="1"/>
+            </w:tcBorders>
+            <w:tcMar>
+              <w:top w:type="dxa" w:w="80"/>
+              <w:left w:type="dxa" w:w="120"/>
+              <w:bottom w:type="dxa" w:w="80"/>
+              <w:right w:type="dxa" w:w="120"/>
+            </w:tcMar>
+          </w:tcPr>
+          <w:p>
+            <w:r>
+              <w:rPr>
+                <w:rFonts w:ascii="Arial" w:cs="Arial" w:eastAsia="Arial" w:hAnsi="Arial"/>
+                <w:sz w:val="20"/>
+                <w:szCs w:val="20"/>
+              </w:rPr>
+              <w:t xml:space="preserve">Full file (top plot)</w:t>
+            </w:r>
+          </w:p>
+        </w:tc>
+        <w:tc>
+          <w:tcPr>
+            <w:tcW w:type="dxa" w:w="1200"/>
+            <w:tcBorders>
+              <w:top w:val="single" w:color="CCCCCC" w:sz="1"/>
+              <w:left w:val="single" w:color="CCCCCC" w:sz="1"/>
+              <w:bottom w:val="single" w:color="CCCCCC" w:sz="1"/>
+              <w:right w:val="single" w:color="CCCCCC" w:sz="1"/>
+            </w:tcBorders>
+            <w:tcMar>
+              <w:top w:type="dxa" w:w="80"/>
+              <w:left w:type="dxa" w:w="120"/>
+              <w:bottom w:type="dxa" w:w="80"/>
+              <w:right w:type="dxa" w:w="120"/>
+            </w:tcMar>
+          </w:tcPr>
+          <w:p>
+            <w:r>
+              <w:rPr>
+                <w:rFonts w:ascii="Arial" w:cs="Arial" w:eastAsia="Arial" w:hAnsi="Arial"/>
+                <w:sz w:val="20"/>
+                <w:szCs w:val="20"/>
+              </w:rPr>
+              <w:t xml:space="preserve">off</w:t>
+            </w:r>
+          </w:p>
+        </w:tc>
+        <w:tc>
+          <w:tcPr>
+            <w:tcW w:type="dxa" w:w="5960"/>
+            <w:tcBorders>
+              <w:top w:val="single" w:color="CCCCCC" w:sz="1"/>
+              <w:left w:val="single" w:color="CCCCCC" w:sz="1"/>
+              <w:bottom w:val="single" w:color="CCCCCC" w:sz="1"/>
+              <w:right w:val="single" w:color="CCCCCC" w:sz="1"/>
+            </w:tcBorders>
+            <w:tcMar>
+              <w:top w:type="dxa" w:w="80"/>
+              <w:left w:type="dxa" w:w="120"/>
+              <w:bottom w:type="dxa" w:w="80"/>
+              <w:right w:type="dxa" w:w="120"/>
+            </w:tcMar>
+          </w:tcPr>
+          <w:p>
+            <w:r>
+              <w:rPr>
+                <w:rFonts w:ascii="Arial" w:cs="Arial" w:eastAsia="Arial" w:hAnsi="Arial"/>
+                <w:sz w:val="20"/>
+                <w:szCs w:val="20"/>
+              </w:rPr>
+              <w:t xml:space="preserve">When checked, the raw-signal plot shows the entire TDD file with the detected segment highlighted (instead of zooming on the event).</w:t>
             </w:r>
           </w:p>
         </w:tc>
@@ -1339,7 +1958,69 @@
         <w:pStyle w:val="Heading2"/>
       </w:pPr>
       <w:r>
-        <w:t xml:space="preserve">3.3 Progress Bar</w:t>
+        <w:t xml:space="preserve">3.3 Progress and Status</w:t>
+      </w:r>
+    </w:p>
+    <w:p>
+      <w:pPr>
+        <w:pStyle w:val="ListParagraph"/>
+        <w:numPr>
+          <w:ilvl w:val="0"/>
+          <w:numId w:val="2"/>
+        </w:numPr>
+        <w:spacing w:after="60"/>
+      </w:pPr>
+      <w:r>
+        <w:rPr>
+          <w:rFonts w:ascii="Arial" w:cs="Arial" w:eastAsia="Arial" w:hAnsi="Arial"/>
+          <w:sz w:val="22"/>
+          <w:szCs w:val="22"/>
+        </w:rPr>
+        <w:t xml:space="preserve">Analyzing indicator — a red, blinking "● Analyzing…" appears next to the progress bar while a scan is running.</w:t>
+      </w:r>
+    </w:p>
+    <w:p>
+      <w:pPr>
+        <w:pStyle w:val="ListParagraph"/>
+        <w:numPr>
+          <w:ilvl w:val="0"/>
+          <w:numId w:val="2"/>
+        </w:numPr>
+        <w:spacing w:after="60"/>
+      </w:pPr>
+      <w:r>
+        <w:rPr>
+          <w:rFonts w:ascii="Arial" w:cs="Arial" w:eastAsia="Arial" w:hAnsi="Arial"/>
+          <w:sz w:val="22"/>
+          <w:szCs w:val="22"/>
+        </w:rPr>
+        <w:t xml:space="preserve">Progress bar — fills as channels finish; the label shows the latest channel that completed (channel completion order is non-deterministic because of parallelism).</w:t>
+      </w:r>
+    </w:p>
+    <w:p>
+      <w:pPr>
+        <w:pStyle w:val="ListParagraph"/>
+        <w:numPr>
+          <w:ilvl w:val="0"/>
+          <w:numId w:val="2"/>
+        </w:numPr>
+        <w:spacing w:after="60"/>
+      </w:pPr>
+      <w:r>
+        <w:rPr>
+          <w:rFonts w:ascii="Arial" w:cs="Arial" w:eastAsia="Arial" w:hAnsi="Arial"/>
+          <w:sz w:val="22"/>
+          <w:szCs w:val="22"/>
+        </w:rPr>
+        <w:t xml:space="preserve">Status line — announces report writes ("Report written: &lt;name&gt;") and final totals.</w:t>
+      </w:r>
+    </w:p>
+    <w:p>
+      <w:pPr>
+        <w:pStyle w:val="Heading2"/>
+      </w:pPr>
+      <w:r>
+        <w:t xml:space="preserve">3.4 Results Table</w:t>
       </w:r>
     </w:p>
     <w:p>
@@ -1352,28 +2033,7 @@
           <w:sz w:val="22"/>
           <w:szCs w:val="22"/>
         </w:rPr>
-        <w:t xml:space="preserve">Displays scan progress showing the current channel and file being analyzed, along with a count of completed items out of the total.</w:t>
-      </w:r>
-    </w:p>
-    <w:p>
-      <w:pPr>
-        <w:pStyle w:val="Heading2"/>
-      </w:pPr>
-      <w:r>
-        <w:t xml:space="preserve">3.4 Results Table (Left Panel)</w:t>
-      </w:r>
-    </w:p>
-    <w:p>
-      <w:pPr>
-        <w:spacing w:after="120"/>
-      </w:pPr>
-      <w:r>
-        <w:rPr>
-          <w:rFonts w:ascii="Arial" w:cs="Arial" w:eastAsia="Arial" w:hAnsi="Arial"/>
-          <w:sz w:val="22"/>
-          <w:szCs w:val="22"/>
-        </w:rPr>
-        <w:t xml:space="preserve">After scanning, each row represents a contiguous time segment where step noise was detected. The table columns are:</w:t>
+        <w:t xml:space="preserve">After scanning, each row is a contiguous segment of step noise on a particular channel. Click a row to plot it; click any column header to sort by that column (an arrow indicator in the header shows current direction).</w:t>
       </w:r>
     </w:p>
     <w:tbl>
@@ -1507,7 +2167,7 @@
                 <w:sz w:val="20"/>
                 <w:szCs w:val="20"/>
               </w:rPr>
-              <w:t xml:space="preserve">Filename (truncated) of the source TDD file.</w:t>
+              <w:t xml:space="preserve">Filename of the source TDD (truncated). For cross-file events this is the first file in the merged span.</w:t>
             </w:r>
           </w:p>
         </w:tc>
@@ -1563,7 +2223,7 @@
                 <w:sz w:val="20"/>
                 <w:szCs w:val="20"/>
               </w:rPr>
-              <w:t xml:space="preserve">Channel ID (physical channel number, sorted numerically).</w:t>
+              <w:t xml:space="preserve">Hardware channel ID (1-based, sorted numerically).</w:t>
             </w:r>
           </w:p>
         </w:tc>
@@ -1619,7 +2279,7 @@
                 <w:sz w:val="20"/>
                 <w:szCs w:val="20"/>
               </w:rPr>
-              <w:t xml:space="preserve">Start time of the step noise segment in seconds from the beginning of the file.</w:t>
+              <w:t xml:space="preserve">Start of the segment, measured from the beginning of the source file.</w:t>
             </w:r>
           </w:p>
         </w:tc>
@@ -1675,7 +2335,7 @@
                 <w:sz w:val="20"/>
                 <w:szCs w:val="20"/>
               </w:rPr>
-              <w:t xml:space="preserve">End time of the step noise segment.</w:t>
+              <w:t xml:space="preserve">End of the segment. For cross-file events this can exceed the source file's duration — the surplus represents time in subsequent files.</w:t>
             </w:r>
           </w:p>
         </w:tc>
@@ -1731,7 +2391,7 @@
                 <w:sz w:val="20"/>
                 <w:szCs w:val="20"/>
               </w:rPr>
-              <w:t xml:space="preserve">Estimated step noise frequency, averaged across merged windows.</w:t>
+              <w:t xml:space="preserve">Periodic mode: autocorrelation peak frequency. Envelope mode: peaks per second.</w:t>
             </w:r>
           </w:p>
         </w:tc>
@@ -1787,7 +2447,7 @@
                 <w:sz w:val="20"/>
                 <w:szCs w:val="20"/>
               </w:rPr>
-              <w:t xml:space="preserve">Maximum peak-to-peak amplitude of the bandpass-filtered signal in the segment (millivolts).</w:t>
+              <w:t xml:space="preserve">Maximum peak-to-peak of the filtered signal across the merged sub-windows of the segment.</w:t>
             </w:r>
           </w:p>
         </w:tc>
@@ -1843,7 +2503,7 @@
                 <w:sz w:val="20"/>
                 <w:szCs w:val="20"/>
               </w:rPr>
-              <w:t xml:space="preserve">Pre-baseline: the highest raw signal value in the 10-second window immediately before the step noise starts.</w:t>
+              <w:t xml:space="preserve">Pre-baseline: maximum raw value in the 10-second window immediately before the segment.</w:t>
             </w:r>
           </w:p>
         </w:tc>
@@ -1899,7 +2559,7 @@
                 <w:sz w:val="20"/>
                 <w:szCs w:val="20"/>
               </w:rPr>
-              <w:t xml:space="preserve">Post-baseline: the highest raw signal value in the 10-second window immediately after the step noise ends. Shows ‘—’ if the segment reaches the end of the file.</w:t>
+              <w:t xml:space="preserve">Post-baseline: maximum raw value in the 10-second window immediately after the segment. Shows "—" if the segment touches the end of the file.</w:t>
             </w:r>
           </w:p>
         </w:tc>
@@ -1955,7 +2615,7 @@
                 <w:sz w:val="20"/>
                 <w:szCs w:val="20"/>
               </w:rPr>
-              <w:t xml:space="preserve">Peak autocorrelation score (0–1). Higher values indicate more regular, periodic step noise.</w:t>
+              <w:t xml:space="preserve">Highest autocorrelation score (0–1) seen across the segment. 0.0 in envelope mode (not measured).</w:t>
             </w:r>
           </w:p>
         </w:tc>
@@ -1963,6 +2623,84 @@
     </w:tbl>
     <w:p>
       <w:pPr>
+        <w:pStyle w:val="Heading2"/>
+      </w:pPr>
+      <w:r>
+        <w:t xml:space="preserve">3.5 Plot Panel</w:t>
+      </w:r>
+    </w:p>
+    <w:p>
+      <w:pPr>
+        <w:pStyle w:val="ListParagraph"/>
+        <w:numPr>
+          <w:ilvl w:val="0"/>
+          <w:numId w:val="2"/>
+        </w:numPr>
+        <w:spacing w:after="60"/>
+      </w:pPr>
+      <w:r>
+        <w:rPr>
+          <w:rFonts w:ascii="Arial" w:cs="Arial" w:eastAsia="Arial" w:hAnsi="Arial"/>
+          <w:sz w:val="22"/>
+          <w:szCs w:val="22"/>
+        </w:rPr>
+        <w:t xml:space="preserve">Top — raw signal in millivolts. Detected region highlighted red. Pre/post baseline horizontal dashes shown. Toggle Full file (top plot) to see the whole file.</w:t>
+      </w:r>
+    </w:p>
+    <w:p>
+      <w:pPr>
+        <w:pStyle w:val="ListParagraph"/>
+        <w:numPr>
+          <w:ilvl w:val="0"/>
+          <w:numId w:val="2"/>
+        </w:numPr>
+        <w:spacing w:after="60"/>
+      </w:pPr>
+      <w:r>
+        <w:rPr>
+          <w:rFonts w:ascii="Arial" w:cs="Arial" w:eastAsia="Arial" w:hAnsi="Arial"/>
+          <w:sz w:val="22"/>
+          <w:szCs w:val="22"/>
+        </w:rPr>
+        <w:t xml:space="preserve">Bottom — the same channel through the bandpass filter, focused on the event window so you can see the periodic structure (or burst envelope in envelope mode).</w:t>
+      </w:r>
+    </w:p>
+    <w:p>
+      <w:pPr>
+        <w:pStyle w:val="ListParagraph"/>
+        <w:numPr>
+          <w:ilvl w:val="0"/>
+          <w:numId w:val="2"/>
+        </w:numPr>
+        <w:spacing w:after="60"/>
+      </w:pPr>
+      <w:r>
+        <w:rPr>
+          <w:rFonts w:ascii="Arial" w:cs="Arial" w:eastAsia="Arial" w:hAnsi="Arial"/>
+          <w:sz w:val="22"/>
+          <w:szCs w:val="22"/>
+        </w:rPr>
+        <w:t xml:space="preserve">Both plots include 5 s of context before and after the event by default. The matplotlib toolbar provides zoom, pan, and save.</w:t>
+      </w:r>
+    </w:p>
+    <w:p>
+      <w:pPr>
+        <w:pStyle w:val="Heading1"/>
+      </w:pPr>
+      <w:r>
+        <w:t xml:space="preserve">4. Detection Algorithm</w:t>
+      </w:r>
+    </w:p>
+    <w:p>
+      <w:pPr>
+        <w:pStyle w:val="Heading2"/>
+      </w:pPr>
+      <w:r>
+        <w:t xml:space="preserve">4.1 Signal Conditioning</w:t>
+      </w:r>
+    </w:p>
+    <w:p>
+      <w:pPr>
         <w:spacing w:after="120"/>
       </w:pPr>
       <w:r>
@@ -1971,7 +2709,7 @@
           <w:sz w:val="22"/>
           <w:szCs w:val="22"/>
         </w:rPr>
-        <w:t xml:space="preserve">Click any row to view the waveform plots in the right panel.</w:t>
+        <w:t xml:space="preserve">Each channel is filtered with a 2nd-order zero-phase Butterworth bandpass. The passband is wider than the user-selected range — 1 Hz below the low cutoff and 5 Hz above the high cutoff — so the rolloff edges don't clip events near the band boundaries. Filter coefficients are designed once per file and shared across all channel threads.</w:t>
       </w:r>
     </w:p>
     <w:p>
@@ -1979,7 +2717,43 @@
         <w:pStyle w:val="Heading2"/>
       </w:pPr>
       <w:r>
-        <w:t xml:space="preserve">3.5 Plot Area (Right Panel)</w:t>
+        <w:t xml:space="preserve">4.2 Sliding Window</w:t>
+      </w:r>
+    </w:p>
+    <w:p>
+      <w:pPr>
+        <w:pStyle w:val="ListParagraph"/>
+        <w:numPr>
+          <w:ilvl w:val="0"/>
+          <w:numId w:val="2"/>
+        </w:numPr>
+        <w:spacing w:after="60"/>
+      </w:pPr>
+      <w:r>
+        <w:rPr>
+          <w:rFonts w:ascii="Arial" w:cs="Arial" w:eastAsia="Arial" w:hAnsi="Arial"/>
+          <w:sz w:val="22"/>
+          <w:szCs w:val="22"/>
+        </w:rPr>
+        <w:t xml:space="preserve">Window length: 10 seconds.</w:t>
+      </w:r>
+    </w:p>
+    <w:p>
+      <w:pPr>
+        <w:pStyle w:val="ListParagraph"/>
+        <w:numPr>
+          <w:ilvl w:val="0"/>
+          <w:numId w:val="2"/>
+        </w:numPr>
+        <w:spacing w:after="60"/>
+      </w:pPr>
+      <w:r>
+        <w:rPr>
+          <w:rFonts w:ascii="Arial" w:cs="Arial" w:eastAsia="Arial" w:hAnsi="Arial"/>
+          <w:sz w:val="22"/>
+          <w:szCs w:val="22"/>
+        </w:rPr>
+        <w:t xml:space="preserve">Step: 5 seconds (50 % overlap).</w:t>
       </w:r>
     </w:p>
     <w:p>
@@ -1992,7 +2766,36 @@
           <w:sz w:val="22"/>
           <w:szCs w:val="22"/>
         </w:rPr>
-        <w:t xml:space="preserve">When a result row is selected, two plots are displayed:</w:t>
+        <w:t xml:space="preserve">Each window passes through a cascade of gates. A window must clear every gate to qualify.</w:t>
+      </w:r>
+    </w:p>
+    <w:p>
+      <w:pPr>
+        <w:pStyle w:val="Heading3"/>
+      </w:pPr>
+      <w:r>
+        <w:t xml:space="preserve">Amplitude gate</w:t>
+      </w:r>
+    </w:p>
+    <w:p>
+      <w:pPr>
+        <w:spacing w:after="120"/>
+      </w:pPr>
+      <w:r>
+        <w:rPr>
+          <w:rFonts w:ascii="Arial" w:cs="Arial" w:eastAsia="Arial" w:hAnsi="Arial"/>
+          <w:sz w:val="22"/>
+          <w:szCs w:val="22"/>
+        </w:rPr>
+        <w:t xml:space="preserve">Peak-to-peak of the filtered window must exceed Amp ≥ (mV).</w:t>
+      </w:r>
+    </w:p>
+    <w:p>
+      <w:pPr>
+        <w:pStyle w:val="Heading3"/>
+      </w:pPr>
+      <w:r>
+        <w:t xml:space="preserve">Periodic mode (default)</w:t>
       </w:r>
     </w:p>
     <w:p>
@@ -2010,7 +2813,7 @@
           <w:sz w:val="22"/>
           <w:szCs w:val="22"/>
         </w:rPr>
-        <w:t xml:space="preserve">Raw Signal (top): The unfiltered channel voltage in millivolts. The detected step noise region is highlighted in red. Green and orange dashed lines show the pre-baseline and post-baseline values respectively.</w:t>
+        <w:t xml:space="preserve">Autocorrelation periodicity gate — the FFT-based normalized autocorrelation must have a peak ≥ Periodicity ≥ inside the lag range that corresponds to the chosen frequency band (lag = sample_rate / freq).</w:t>
       </w:r>
     </w:p>
     <w:p>
@@ -2028,7 +2831,193 @@
           <w:sz w:val="22"/>
           <w:szCs w:val="22"/>
         </w:rPr>
-        <w:t xml:space="preserve">Bandpass Filtered (bottom): The signal after bandpass filtering in the configured frequency range, showing the periodic step noise pattern clearly.</w:t>
+        <w:t xml:space="preserve">Second-harmonic gate — a true periodic signal repeats at multiples of the fundamental lag, so the autocorrelation at 2× the peak lag must be ≥ 0.05. A single transient pulse passes the autocorrelation peak but fails this check.</w:t>
+      </w:r>
+    </w:p>
+    <w:p>
+      <w:pPr>
+        <w:pStyle w:val="ListParagraph"/>
+        <w:numPr>
+          <w:ilvl w:val="0"/>
+          <w:numId w:val="2"/>
+        </w:numPr>
+        <w:spacing w:after="60"/>
+      </w:pPr>
+      <w:r>
+        <w:rPr>
+          <w:rFonts w:ascii="Arial" w:cs="Arial" w:eastAsia="Arial" w:hAnsi="Arial"/>
+          <w:sz w:val="22"/>
+          <w:szCs w:val="22"/>
+        </w:rPr>
+        <w:t xml:space="preserve">Peak-count gate — the count of positive peaks above 20 % of the segment's pp must be at least 30 % of the count expected at the detected frequency. This rejects single spike + ringdown patterns that fool autocorrelation.</w:t>
+      </w:r>
+    </w:p>
+    <w:p>
+      <w:pPr>
+        <w:pStyle w:val="ListParagraph"/>
+        <w:numPr>
+          <w:ilvl w:val="0"/>
+          <w:numId w:val="2"/>
+        </w:numPr>
+        <w:spacing w:after="60"/>
+      </w:pPr>
+      <w:r>
+        <w:rPr>
+          <w:rFonts w:ascii="Arial" w:cs="Arial" w:eastAsia="Arial" w:hAnsi="Arial"/>
+          <w:sz w:val="22"/>
+          <w:szCs w:val="22"/>
+        </w:rPr>
+        <w:t xml:space="preserve">Frequency = sample_rate / peak-lag.</w:t>
+      </w:r>
+    </w:p>
+    <w:p>
+      <w:pPr>
+        <w:pStyle w:val="Heading3"/>
+      </w:pPr>
+      <w:r>
+        <w:t xml:space="preserve">Envelope mode (toggle)</w:t>
+      </w:r>
+    </w:p>
+    <w:p>
+      <w:pPr>
+        <w:pStyle w:val="ListParagraph"/>
+        <w:numPr>
+          <w:ilvl w:val="0"/>
+          <w:numId w:val="2"/>
+        </w:numPr>
+        <w:spacing w:after="60"/>
+      </w:pPr>
+      <w:r>
+        <w:rPr>
+          <w:rFonts w:ascii="Arial" w:cs="Arial" w:eastAsia="Arial" w:hAnsi="Arial"/>
+          <w:sz w:val="22"/>
+          <w:szCs w:val="22"/>
+        </w:rPr>
+        <w:t xml:space="preserve">Skips the autocorrelation and second-harmonic gates entirely.</w:t>
+      </w:r>
+    </w:p>
+    <w:p>
+      <w:pPr>
+        <w:pStyle w:val="ListParagraph"/>
+        <w:numPr>
+          <w:ilvl w:val="0"/>
+          <w:numId w:val="2"/>
+        </w:numPr>
+        <w:spacing w:after="60"/>
+      </w:pPr>
+      <w:r>
+        <w:rPr>
+          <w:rFonts w:ascii="Arial" w:cs="Arial" w:eastAsia="Arial" w:hAnsi="Arial"/>
+          <w:sz w:val="22"/>
+          <w:szCs w:val="22"/>
+        </w:rPr>
+        <w:t xml:space="preserve">Counts positive peaks (above 20 % of pp) in the window.</w:t>
+      </w:r>
+    </w:p>
+    <w:p>
+      <w:pPr>
+        <w:pStyle w:val="ListParagraph"/>
+        <w:numPr>
+          <w:ilvl w:val="0"/>
+          <w:numId w:val="2"/>
+        </w:numPr>
+        <w:spacing w:after="60"/>
+      </w:pPr>
+      <w:r>
+        <w:rPr>
+          <w:rFonts w:ascii="Arial" w:cs="Arial" w:eastAsia="Arial" w:hAnsi="Arial"/>
+          <w:sz w:val="22"/>
+          <w:szCs w:val="22"/>
+        </w:rPr>
+        <w:t xml:space="preserve">Window passes if there are at least 10 peaks AND the implied frequency (peaks / 10 s) lies inside the user's frequency band.</w:t>
+      </w:r>
+    </w:p>
+    <w:p>
+      <w:pPr>
+        <w:pStyle w:val="ListParagraph"/>
+        <w:numPr>
+          <w:ilvl w:val="0"/>
+          <w:numId w:val="2"/>
+        </w:numPr>
+        <w:spacing w:after="60"/>
+      </w:pPr>
+      <w:r>
+        <w:rPr>
+          <w:rFonts w:ascii="Arial" w:cs="Arial" w:eastAsia="Arial" w:hAnsi="Arial"/>
+          <w:sz w:val="22"/>
+          <w:szCs w:val="22"/>
+        </w:rPr>
+        <w:t xml:space="preserve">Frequency = peaks / 10 s. Periodicity is reported as 0.0 because it is not measured.</w:t>
+      </w:r>
+    </w:p>
+    <w:p>
+      <w:pPr>
+        <w:pStyle w:val="Heading2"/>
+      </w:pPr>
+      <w:r>
+        <w:t xml:space="preserve">4.3 Merging and Boundary Refinement</w:t>
+      </w:r>
+    </w:p>
+    <w:p>
+      <w:pPr>
+        <w:pStyle w:val="ListParagraph"/>
+        <w:numPr>
+          <w:ilvl w:val="0"/>
+          <w:numId w:val="2"/>
+        </w:numPr>
+        <w:spacing w:after="60"/>
+      </w:pPr>
+      <w:r>
+        <w:rPr>
+          <w:rFonts w:ascii="Arial" w:cs="Arial" w:eastAsia="Arial" w:hAnsi="Arial"/>
+          <w:sz w:val="22"/>
+          <w:szCs w:val="22"/>
+        </w:rPr>
+        <w:t xml:space="preserve">Adjacent qualifying windows within Gap (s) are merged into one segment. Maximum amplitude and periodicity are kept; frequencies are averaged.</w:t>
+      </w:r>
+    </w:p>
+    <w:p>
+      <w:pPr>
+        <w:pStyle w:val="ListParagraph"/>
+        <w:numPr>
+          <w:ilvl w:val="0"/>
+          <w:numId w:val="2"/>
+        </w:numPr>
+        <w:spacing w:after="60"/>
+      </w:pPr>
+      <w:r>
+        <w:rPr>
+          <w:rFonts w:ascii="Arial" w:cs="Arial" w:eastAsia="Arial" w:hAnsi="Arial"/>
+          <w:sz w:val="22"/>
+          <w:szCs w:val="22"/>
+        </w:rPr>
+        <w:t xml:space="preserve">After merging, the segment edges are refined: the algorithm walks outward from each edge in 2-second sub-windows and extends the segment as long as the local pp is at least 30 % of the segment's measured pp. Up to 3 consecutive quiet sub-windows (≈6 s) are tolerated before stopping, so brief envelope dips don't truncate events.</w:t>
+      </w:r>
+    </w:p>
+    <w:p>
+      <w:pPr>
+        <w:pStyle w:val="ListParagraph"/>
+        <w:numPr>
+          <w:ilvl w:val="0"/>
+          <w:numId w:val="2"/>
+        </w:numPr>
+        <w:spacing w:after="60"/>
+      </w:pPr>
+      <w:r>
+        <w:rPr>
+          <w:rFonts w:ascii="Arial" w:cs="Arial" w:eastAsia="Arial" w:hAnsi="Arial"/>
+          <w:sz w:val="22"/>
+          <w:szCs w:val="22"/>
+        </w:rPr>
+        <w:t xml:space="preserve">Refinement may cause initially separate segments to overlap, so a second merge pass is run afterward.</w:t>
+      </w:r>
+    </w:p>
+    <w:p>
+      <w:pPr>
+        <w:pStyle w:val="Heading2"/>
+      </w:pPr>
+      <w:r>
+        <w:t xml:space="preserve">4.4 Cross-file Merging</w:t>
       </w:r>
     </w:p>
     <w:p>
@@ -2041,7 +3030,20 @@
           <w:sz w:val="22"/>
           <w:szCs w:val="22"/>
         </w:rPr>
-        <w:t xml:space="preserve">Both plots include 5 seconds of context before and after the detected segment. The matplotlib toolbar below the plots provides zoom, pan, and save functionality.</w:t>
+        <w:t xml:space="preserve">In a folder scan, after every file in a folder has been processed, the per-file segments are projected onto wall-clock time using each TDD file's DataStartTime. Same-channel segments whose wall-clock gap is within the user's Gap (s) value are merged into a single event. The merged event is reported against the first contributing file, with start/end times measured from that file's start (so end may exceed that file's duration when the event spans into later files).</w:t>
+      </w:r>
+    </w:p>
+    <w:p>
+      <w:pPr>
+        <w:spacing w:after="120"/>
+      </w:pPr>
+      <w:r>
+        <w:rPr>
+          <w:rFonts w:ascii="Arial" w:cs="Arial" w:eastAsia="Arial" w:hAnsi="Arial"/>
+          <w:sz w:val="22"/>
+          <w:szCs w:val="22"/>
+        </w:rPr>
+        <w:t xml:space="preserve">To merge across files that are recorded ~3 minutes apart, set Gap (s) to roughly the file-to-file gap (e.g. 200) before scanning.</w:t>
       </w:r>
     </w:p>
     <w:p>
@@ -2049,7 +3051,263 @@
         <w:pStyle w:val="Heading2"/>
       </w:pPr>
       <w:r>
-        <w:t xml:space="preserve">3.6 Status Bar</w:t>
+        <w:t xml:space="preserve">4.5 Baselines</w:t>
+      </w:r>
+    </w:p>
+    <w:p>
+      <w:pPr>
+        <w:pStyle w:val="ListParagraph"/>
+        <w:numPr>
+          <w:ilvl w:val="0"/>
+          <w:numId w:val="2"/>
+        </w:numPr>
+        <w:spacing w:after="60"/>
+      </w:pPr>
+      <w:r>
+        <w:rPr>
+          <w:rFonts w:ascii="Arial" w:cs="Arial" w:eastAsia="Arial" w:hAnsi="Arial"/>
+          <w:sz w:val="22"/>
+          <w:szCs w:val="22"/>
+        </w:rPr>
+        <w:t xml:space="preserve">Pre-baseline — the maximum raw value in the 10-second window immediately before the segment.</w:t>
+      </w:r>
+    </w:p>
+    <w:p>
+      <w:pPr>
+        <w:pStyle w:val="ListParagraph"/>
+        <w:numPr>
+          <w:ilvl w:val="0"/>
+          <w:numId w:val="2"/>
+        </w:numPr>
+        <w:spacing w:after="60"/>
+      </w:pPr>
+      <w:r>
+        <w:rPr>
+          <w:rFonts w:ascii="Arial" w:cs="Arial" w:eastAsia="Arial" w:hAnsi="Arial"/>
+          <w:sz w:val="22"/>
+          <w:szCs w:val="22"/>
+        </w:rPr>
+        <w:t xml:space="preserve">Post-baseline — the maximum raw value in the 10-second window immediately after the segment, when data is available; otherwise blank.</w:t>
+      </w:r>
+    </w:p>
+    <w:p>
+      <w:pPr>
+        <w:pStyle w:val="Heading1"/>
+      </w:pPr>
+      <w:r>
+        <w:t xml:space="preserve">5. Typical Workflow</w:t>
+      </w:r>
+    </w:p>
+    <w:p>
+      <w:pPr>
+        <w:pStyle w:val="Heading2"/>
+      </w:pPr>
+      <w:r>
+        <w:t xml:space="preserve">5.1 Single file</w:t>
+      </w:r>
+    </w:p>
+    <w:p>
+      <w:pPr>
+        <w:pStyle w:val="ListParagraph"/>
+        <w:numPr>
+          <w:ilvl w:val="0"/>
+          <w:numId w:val="3"/>
+        </w:numPr>
+        <w:spacing w:after="60"/>
+      </w:pPr>
+      <w:r>
+        <w:rPr>
+          <w:rFonts w:ascii="Arial" w:cs="Arial" w:eastAsia="Arial" w:hAnsi="Arial"/>
+          <w:sz w:val="22"/>
+          <w:szCs w:val="22"/>
+        </w:rPr>
+        <w:t xml:space="preserve">File → Open TDD… (or Ctrl+O).</w:t>
+      </w:r>
+    </w:p>
+    <w:p>
+      <w:pPr>
+        <w:pStyle w:val="ListParagraph"/>
+        <w:numPr>
+          <w:ilvl w:val="0"/>
+          <w:numId w:val="3"/>
+        </w:numPr>
+        <w:spacing w:after="60"/>
+      </w:pPr>
+      <w:r>
+        <w:rPr>
+          <w:rFonts w:ascii="Arial" w:cs="Arial" w:eastAsia="Arial" w:hAnsi="Arial"/>
+          <w:sz w:val="22"/>
+          <w:szCs w:val="22"/>
+        </w:rPr>
+        <w:t xml:space="preserve">Adjust Amp / Freq / Periodicity / Gap if needed. Try Envelope mode for non-periodic bursts.</w:t>
+      </w:r>
+    </w:p>
+    <w:p>
+      <w:pPr>
+        <w:pStyle w:val="ListParagraph"/>
+        <w:numPr>
+          <w:ilvl w:val="0"/>
+          <w:numId w:val="3"/>
+        </w:numPr>
+        <w:spacing w:after="60"/>
+      </w:pPr>
+      <w:r>
+        <w:rPr>
+          <w:rFonts w:ascii="Arial" w:cs="Arial" w:eastAsia="Arial" w:hAnsi="Arial"/>
+          <w:sz w:val="22"/>
+          <w:szCs w:val="22"/>
+        </w:rPr>
+        <w:t xml:space="preserve">Click Scan All Channels.</w:t>
+      </w:r>
+    </w:p>
+    <w:p>
+      <w:pPr>
+        <w:pStyle w:val="ListParagraph"/>
+        <w:numPr>
+          <w:ilvl w:val="0"/>
+          <w:numId w:val="3"/>
+        </w:numPr>
+        <w:spacing w:after="60"/>
+      </w:pPr>
+      <w:r>
+        <w:rPr>
+          <w:rFonts w:ascii="Arial" w:cs="Arial" w:eastAsia="Arial" w:hAnsi="Arial"/>
+          <w:sz w:val="22"/>
+          <w:szCs w:val="22"/>
+        </w:rPr>
+        <w:t xml:space="preserve">Sort columns to find the strongest events. Click any row to inspect.</w:t>
+      </w:r>
+    </w:p>
+    <w:p>
+      <w:pPr>
+        <w:pStyle w:val="Heading2"/>
+      </w:pPr>
+      <w:r>
+        <w:t xml:space="preserve">5.2 One folder</w:t>
+      </w:r>
+    </w:p>
+    <w:p>
+      <w:pPr>
+        <w:pStyle w:val="ListParagraph"/>
+        <w:numPr>
+          <w:ilvl w:val="0"/>
+          <w:numId w:val="3"/>
+        </w:numPr>
+        <w:spacing w:after="60"/>
+      </w:pPr>
+      <w:r>
+        <w:rPr>
+          <w:rFonts w:ascii="Arial" w:cs="Arial" w:eastAsia="Arial" w:hAnsi="Arial"/>
+          <w:sz w:val="22"/>
+          <w:szCs w:val="22"/>
+        </w:rPr>
+        <w:t xml:space="preserve">File → Scan Baselines…</w:t>
+      </w:r>
+    </w:p>
+    <w:p>
+      <w:pPr>
+        <w:pStyle w:val="ListParagraph"/>
+        <w:numPr>
+          <w:ilvl w:val="0"/>
+          <w:numId w:val="3"/>
+        </w:numPr>
+        <w:spacing w:after="60"/>
+      </w:pPr>
+      <w:r>
+        <w:rPr>
+          <w:rFonts w:ascii="Arial" w:cs="Arial" w:eastAsia="Arial" w:hAnsi="Arial"/>
+          <w:sz w:val="22"/>
+          <w:szCs w:val="22"/>
+        </w:rPr>
+        <w:t xml:space="preserve">Browse to the folder with *Baseline*.tdd files. The picker shows the matching files for confirmation.</w:t>
+      </w:r>
+    </w:p>
+    <w:p>
+      <w:pPr>
+        <w:pStyle w:val="ListParagraph"/>
+        <w:numPr>
+          <w:ilvl w:val="0"/>
+          <w:numId w:val="3"/>
+        </w:numPr>
+        <w:spacing w:after="60"/>
+      </w:pPr>
+      <w:r>
+        <w:rPr>
+          <w:rFonts w:ascii="Arial" w:cs="Arial" w:eastAsia="Arial" w:hAnsi="Arial"/>
+          <w:sz w:val="22"/>
+          <w:szCs w:val="22"/>
+        </w:rPr>
+        <w:t xml:space="preserve">Click OK. Scan starts immediately and writes a report to results/ when it finishes.</w:t>
+      </w:r>
+    </w:p>
+    <w:p>
+      <w:pPr>
+        <w:pStyle w:val="Heading2"/>
+      </w:pPr>
+      <w:r>
+        <w:t xml:space="preserve">5.3 Many folders</w:t>
+      </w:r>
+    </w:p>
+    <w:p>
+      <w:pPr>
+        <w:pStyle w:val="ListParagraph"/>
+        <w:numPr>
+          <w:ilvl w:val="0"/>
+          <w:numId w:val="3"/>
+        </w:numPr>
+        <w:spacing w:after="60"/>
+      </w:pPr>
+      <w:r>
+        <w:rPr>
+          <w:rFonts w:ascii="Arial" w:cs="Arial" w:eastAsia="Arial" w:hAnsi="Arial"/>
+          <w:sz w:val="22"/>
+          <w:szCs w:val="22"/>
+        </w:rPr>
+        <w:t xml:space="preserve">File → Scan Folders… to add folders one at a time, or File → Scan All Runs… to pick a root and let the app discover every Baseline-containing folder under it.</w:t>
+      </w:r>
+    </w:p>
+    <w:p>
+      <w:pPr>
+        <w:pStyle w:val="ListParagraph"/>
+        <w:numPr>
+          <w:ilvl w:val="0"/>
+          <w:numId w:val="3"/>
+        </w:numPr>
+        <w:spacing w:after="60"/>
+      </w:pPr>
+      <w:r>
+        <w:rPr>
+          <w:rFonts w:ascii="Arial" w:cs="Arial" w:eastAsia="Arial" w:hAnsi="Arial"/>
+          <w:sz w:val="22"/>
+          <w:szCs w:val="22"/>
+        </w:rPr>
+        <w:t xml:space="preserve">Inspect the discovered runs in the preview dialog. Remove any you don't want.</w:t>
+      </w:r>
+    </w:p>
+    <w:p>
+      <w:pPr>
+        <w:pStyle w:val="ListParagraph"/>
+        <w:numPr>
+          <w:ilvl w:val="0"/>
+          <w:numId w:val="3"/>
+        </w:numPr>
+        <w:spacing w:after="60"/>
+      </w:pPr>
+      <w:r>
+        <w:rPr>
+          <w:rFonts w:ascii="Arial" w:cs="Arial" w:eastAsia="Arial" w:hAnsi="Arial"/>
+          <w:sz w:val="22"/>
+          <w:szCs w:val="22"/>
+        </w:rPr>
+        <w:t xml:space="preserve">Scan. One report is written per source folder, named after the run and the time of the scan.</w:t>
+      </w:r>
+    </w:p>
+    <w:p>
+      <w:pPr>
+        <w:pStyle w:val="Heading2"/>
+      </w:pPr>
+      <w:r>
+        <w:t xml:space="preserve">5.4 Re-scanning with new parameters</w:t>
       </w:r>
     </w:p>
     <w:p>
@@ -2062,7 +3320,7 @@
           <w:sz w:val="22"/>
           <w:szCs w:val="22"/>
         </w:rPr>
-        <w:t xml:space="preserve">The bottom status bar shows the current application state: file loading status, scan progress summary, or scan completion results (number of segments, channels, and files with detections).</w:t>
+        <w:t xml:space="preserve">After any scan, the Scan All Channels button stays enabled. Tweak the toolbar parameters and click again — the same files are rescanned with the new settings. There is no need to re-pick the folder.</w:t>
       </w:r>
     </w:p>
     <w:p>
@@ -2070,7 +3328,7 @@
         <w:pStyle w:val="Heading1"/>
       </w:pPr>
       <w:r>
-        <w:t xml:space="preserve">4. Detection Algorithm</w:t>
+        <w:t xml:space="preserve">6. Output Files</w:t>
       </w:r>
     </w:p>
     <w:p>
@@ -2083,7 +3341,56 @@
           <w:sz w:val="22"/>
           <w:szCs w:val="22"/>
         </w:rPr>
-        <w:t xml:space="preserve">The step noise detection uses a sliding-window approach combining bandpass filtering with autocorrelation analysis:</w:t>
+        <w:t xml:space="preserve">Reports are written under the project's results/ directory (created if it does not exist). One pair of files is produced per source folder:</w:t>
+      </w:r>
+    </w:p>
+    <w:p>
+      <w:pPr>
+        <w:pStyle w:val="ListParagraph"/>
+        <w:numPr>
+          <w:ilvl w:val="0"/>
+          <w:numId w:val="2"/>
+        </w:numPr>
+        <w:spacing w:after="60"/>
+      </w:pPr>
+      <w:r>
+        <w:rPr>
+          <w:rFonts w:ascii="Arial" w:cs="Arial" w:eastAsia="Arial" w:hAnsi="Arial"/>
+          <w:sz w:val="22"/>
+          <w:szCs w:val="22"/>
+        </w:rPr>
+        <w:t xml:space="preserve">&lt;run-name&gt;_&lt;timestamp&gt;.txt — a human-readable text report listing every detected segment with its file, channel, start/end, frequency, amplitude, baselines, and periodicity. The header records the parameters used for the scan.</w:t>
+      </w:r>
+    </w:p>
+    <w:p>
+      <w:pPr>
+        <w:pStyle w:val="ListParagraph"/>
+        <w:numPr>
+          <w:ilvl w:val="0"/>
+          <w:numId w:val="2"/>
+        </w:numPr>
+        <w:spacing w:after="60"/>
+      </w:pPr>
+      <w:r>
+        <w:rPr>
+          <w:rFonts w:ascii="Arial" w:cs="Arial" w:eastAsia="Arial" w:hAnsi="Arial"/>
+          <w:sz w:val="22"/>
+          <w:szCs w:val="22"/>
+        </w:rPr>
+        <w:t xml:space="preserve">&lt;run-name&gt;_&lt;timestamp&gt;.json — a Sherlock-compatible RunResults JSON, suitable for downstream analysis. Run-level metadata (run_id, wafer_id, die_number, lot_number, instrument_id) is pulled from the TDD header. Aggressors are keyed by channel, then by wall-clock ISO timestamp of the event's first sample.</w:t>
+      </w:r>
+    </w:p>
+    <w:p>
+      <w:pPr>
+        <w:spacing w:after="120"/>
+      </w:pPr>
+      <w:r>
+        <w:rPr>
+          <w:rFonts w:ascii="Arial" w:cs="Arial" w:eastAsia="Arial" w:hAnsi="Arial"/>
+          <w:sz w:val="22"/>
+          <w:szCs w:val="22"/>
+        </w:rPr>
+        <w:t xml:space="preserve">The run name is derived from the first four dash-separated parts of the TDD filename (e.g. HAK04-008B-02L64869w15-205B16a). The File column inside the .txt report shows only the 14-digit datetime code from each filename.</w:t>
       </w:r>
     </w:p>
     <w:p>
@@ -2091,7 +3398,7 @@
         <w:pStyle w:val="Heading2"/>
       </w:pPr>
       <w:r>
-        <w:t xml:space="preserve">4.1 Signal Conditioning</w:t>
+        <w:t xml:space="preserve">6.1 Settings file</w:t>
       </w:r>
     </w:p>
     <w:p>
@@ -2104,352 +3411,7 @@
           <w:sz w:val="22"/>
           <w:szCs w:val="22"/>
         </w:rPr>
-        <w:t xml:space="preserve">The raw channel data (in microvolts) is passed through a 2nd-order zero-phase Butterworth bandpass filter. The passband is set slightly wider than the configured frequency range (1 Hz below the low cutoff, 5 Hz above the high cutoff) to avoid edge effects.</w:t>
-      </w:r>
-    </w:p>
-    <w:p>
-      <w:pPr>
-        <w:pStyle w:val="Heading2"/>
-      </w:pPr>
-      <w:r>
-        <w:t xml:space="preserve">4.2 Sliding Window Analysis</w:t>
-      </w:r>
-    </w:p>
-    <w:p>
-      <w:pPr>
-        <w:spacing w:after="120"/>
-      </w:pPr>
-      <w:r>
-        <w:rPr>
-          <w:rFonts w:ascii="Arial" w:cs="Arial" w:eastAsia="Arial" w:hAnsi="Arial"/>
-          <w:sz w:val="22"/>
-          <w:szCs w:val="22"/>
-        </w:rPr>
-        <w:t xml:space="preserve">The filtered signal is divided into overlapping windows:</w:t>
-      </w:r>
-    </w:p>
-    <w:p>
-      <w:pPr>
-        <w:pStyle w:val="ListParagraph"/>
-        <w:numPr>
-          <w:ilvl w:val="0"/>
-          <w:numId w:val="2"/>
-        </w:numPr>
-        <w:spacing w:after="60"/>
-      </w:pPr>
-      <w:r>
-        <w:rPr>
-          <w:rFonts w:ascii="Arial" w:cs="Arial" w:eastAsia="Arial" w:hAnsi="Arial"/>
-          <w:sz w:val="22"/>
-          <w:szCs w:val="22"/>
-        </w:rPr>
-        <w:t xml:space="preserve">Window size: 10 seconds (1000 samples at 100 Hz)</w:t>
-      </w:r>
-    </w:p>
-    <w:p>
-      <w:pPr>
-        <w:pStyle w:val="ListParagraph"/>
-        <w:numPr>
-          <w:ilvl w:val="0"/>
-          <w:numId w:val="2"/>
-        </w:numPr>
-        <w:spacing w:after="60"/>
-      </w:pPr>
-      <w:r>
-        <w:rPr>
-          <w:rFonts w:ascii="Arial" w:cs="Arial" w:eastAsia="Arial" w:hAnsi="Arial"/>
-          <w:sz w:val="22"/>
-          <w:szCs w:val="22"/>
-        </w:rPr>
-        <w:t xml:space="preserve">Overlap: 50% (windows advance by 5 seconds)</w:t>
-      </w:r>
-    </w:p>
-    <w:p>
-      <w:pPr>
-        <w:spacing w:after="120"/>
-      </w:pPr>
-      <w:r>
-        <w:rPr>
-          <w:rFonts w:ascii="Arial" w:cs="Arial" w:eastAsia="Arial" w:hAnsi="Arial"/>
-          <w:sz w:val="22"/>
-          <w:szCs w:val="22"/>
-        </w:rPr>
-        <w:t xml:space="preserve">For each window, two tests are applied:</w:t>
-      </w:r>
-    </w:p>
-    <w:p>
-      <w:pPr>
-        <w:pStyle w:val="Heading3"/>
-      </w:pPr>
-      <w:r>
-        <w:t xml:space="preserve">Amplitude Gate</w:t>
-      </w:r>
-    </w:p>
-    <w:p>
-      <w:pPr>
-        <w:spacing w:after="120"/>
-      </w:pPr>
-      <w:r>
-        <w:rPr>
-          <w:rFonts w:ascii="Arial" w:cs="Arial" w:eastAsia="Arial" w:hAnsi="Arial"/>
-          <w:sz w:val="22"/>
-          <w:szCs w:val="22"/>
-        </w:rPr>
-        <w:t xml:space="preserve">The peak-to-peak amplitude of the filtered signal in the window is computed. If it is below the configured minimum (default 100 mV), the window is skipped. This eliminates quiet segments quickly.</w:t>
-      </w:r>
-    </w:p>
-    <w:p>
-      <w:pPr>
-        <w:pStyle w:val="Heading3"/>
-      </w:pPr>
-      <w:r>
-        <w:t xml:space="preserve">Periodicity Check (Autocorrelation)</w:t>
-      </w:r>
-    </w:p>
-    <w:p>
-      <w:pPr>
-        <w:spacing w:after="120"/>
-      </w:pPr>
-      <w:r>
-        <w:rPr>
-          <w:rFonts w:ascii="Arial" w:cs="Arial" w:eastAsia="Arial" w:hAnsi="Arial"/>
-          <w:sz w:val="22"/>
-          <w:szCs w:val="22"/>
-        </w:rPr>
-        <w:t xml:space="preserve">Autocorrelation measures how similar a signal is to a time-shifted copy of itself. For a periodic signal like step noise, the signal at time t closely resembles the signal at time t + T, where T is the period of the repeating pattern. This self-similarity produces a strong peak in the autocorrelation function at lag T.</w:t>
-      </w:r>
-    </w:p>
-    <w:p>
-      <w:pPr>
-        <w:spacing w:after="120"/>
-      </w:pPr>
-      <w:r>
-        <w:rPr>
-          <w:rFonts w:ascii="Arial" w:cs="Arial" w:eastAsia="Arial" w:hAnsi="Arial"/>
-          <w:sz w:val="22"/>
-          <w:szCs w:val="22"/>
-        </w:rPr>
-        <w:t xml:space="preserve">The algorithm computes the full normalized autocorrelation of the windowed signal, then examines only the lag range that corresponds to the target frequency band:</w:t>
-      </w:r>
-    </w:p>
-    <w:p>
-      <w:pPr>
-        <w:pStyle w:val="ListParagraph"/>
-        <w:numPr>
-          <w:ilvl w:val="0"/>
-          <w:numId w:val="2"/>
-        </w:numPr>
-        <w:spacing w:after="60"/>
-      </w:pPr>
-      <w:r>
-        <w:rPr>
-          <w:rFonts w:ascii="Arial" w:cs="Arial" w:eastAsia="Arial" w:hAnsi="Arial"/>
-          <w:sz w:val="22"/>
-          <w:szCs w:val="22"/>
-        </w:rPr>
-        <w:t xml:space="preserve">Minimum lag = sample_rate / freq_hi — the shortest period to look for. At 100 Hz sample rate and 20 Hz upper limit, this is 100/20 = 5 samples (0.05 seconds).</w:t>
-      </w:r>
-    </w:p>
-    <w:p>
-      <w:pPr>
-        <w:pStyle w:val="ListParagraph"/>
-        <w:numPr>
-          <w:ilvl w:val="0"/>
-          <w:numId w:val="2"/>
-        </w:numPr>
-        <w:spacing w:after="60"/>
-      </w:pPr>
-      <w:r>
-        <w:rPr>
-          <w:rFonts w:ascii="Arial" w:cs="Arial" w:eastAsia="Arial" w:hAnsi="Arial"/>
-          <w:sz w:val="22"/>
-          <w:szCs w:val="22"/>
-        </w:rPr>
-        <w:t xml:space="preserve">Maximum lag = sample_rate / freq_lo — the longest period to look for. At 100 Hz and 4 Hz lower limit, this is 100/4 = 25 samples (0.25 seconds).</w:t>
-      </w:r>
-    </w:p>
-    <w:p>
-      <w:pPr>
-        <w:spacing w:after="120"/>
-      </w:pPr>
-      <w:r>
-        <w:rPr>
-          <w:rFonts w:ascii="Arial" w:cs="Arial" w:eastAsia="Arial" w:hAnsi="Arial"/>
-          <w:sz w:val="22"/>
-          <w:szCs w:val="22"/>
-        </w:rPr>
-        <w:t xml:space="preserve">The autocorrelation is normalized so that lag 0 (perfect self-match) equals 1.0. The peak value found in the target lag range is the periodicity score:</w:t>
-      </w:r>
-    </w:p>
-    <w:p>
-      <w:pPr>
-        <w:pStyle w:val="ListParagraph"/>
-        <w:numPr>
-          <w:ilvl w:val="0"/>
-          <w:numId w:val="2"/>
-        </w:numPr>
-        <w:spacing w:after="60"/>
-      </w:pPr>
-      <w:r>
-        <w:rPr>
-          <w:rFonts w:ascii="Arial" w:cs="Arial" w:eastAsia="Arial" w:hAnsi="Arial"/>
-          <w:sz w:val="22"/>
-          <w:szCs w:val="22"/>
-        </w:rPr>
-        <w:t xml:space="preserve">A score near 0 means the signal has no repeating pattern at that frequency — it is random noise.</w:t>
-      </w:r>
-    </w:p>
-    <w:p>
-      <w:pPr>
-        <w:pStyle w:val="ListParagraph"/>
-        <w:numPr>
-          <w:ilvl w:val="0"/>
-          <w:numId w:val="2"/>
-        </w:numPr>
-        <w:spacing w:after="60"/>
-      </w:pPr>
-      <w:r>
-        <w:rPr>
-          <w:rFonts w:ascii="Arial" w:cs="Arial" w:eastAsia="Arial" w:hAnsi="Arial"/>
-          <w:sz w:val="22"/>
-          <w:szCs w:val="22"/>
-        </w:rPr>
-        <w:t xml:space="preserve">A score of 0.4–0.6 indicates a moderately periodic signal — step noise is present but may be irregular or mixed with other noise.</w:t>
-      </w:r>
-    </w:p>
-    <w:p>
-      <w:pPr>
-        <w:pStyle w:val="ListParagraph"/>
-        <w:numPr>
-          <w:ilvl w:val="0"/>
-          <w:numId w:val="2"/>
-        </w:numPr>
-        <w:spacing w:after="60"/>
-      </w:pPr>
-      <w:r>
-        <w:rPr>
-          <w:rFonts w:ascii="Arial" w:cs="Arial" w:eastAsia="Arial" w:hAnsi="Arial"/>
-          <w:sz w:val="22"/>
-          <w:szCs w:val="22"/>
-        </w:rPr>
-        <w:t xml:space="preserve">A score above 0.7 indicates a very regular, strong periodic pattern — clean, consistent step noise.</w:t>
-      </w:r>
-    </w:p>
-    <w:p>
-      <w:pPr>
-        <w:spacing w:after="120"/>
-      </w:pPr>
-      <w:r>
-        <w:rPr>
-          <w:rFonts w:ascii="Arial" w:cs="Arial" w:eastAsia="Arial" w:hAnsi="Arial"/>
-          <w:sz w:val="22"/>
-          <w:szCs w:val="22"/>
-        </w:rPr>
-        <w:t xml:space="preserve">The lag at which the peak occurs directly gives the step noise frequency: frequency = sample_rate / peak_lag. For example, a peak at lag 10 at 100 Hz sample rate gives 100/10 = 10 Hz step noise.</w:t>
-      </w:r>
-    </w:p>
-    <w:p>
-      <w:pPr>
-        <w:spacing w:after="120"/>
-      </w:pPr>
-      <w:r>
-        <w:rPr>
-          <w:rFonts w:ascii="Arial" w:cs="Arial" w:eastAsia="Arial" w:hAnsi="Arial"/>
-          <w:sz w:val="22"/>
-          <w:szCs w:val="22"/>
-        </w:rPr>
-        <w:t xml:space="preserve">The default periodicity threshold of 0.4 was empirically chosen to reliably separate true periodic step noise from random high-amplitude fluctuations. Random noise rarely produces autocorrelation peaks above 0.3 in the 4–20 Hz lag range, while even moderate step noise typically exceeds 0.4.</w:t>
-      </w:r>
-    </w:p>
-    <w:p>
-      <w:pPr>
-        <w:pStyle w:val="Heading2"/>
-      </w:pPr>
-      <w:r>
-        <w:t xml:space="preserve">4.3 Merging</w:t>
-      </w:r>
-    </w:p>
-    <w:p>
-      <w:pPr>
-        <w:spacing w:after="120"/>
-      </w:pPr>
-      <w:r>
-        <w:rPr>
-          <w:rFonts w:ascii="Arial" w:cs="Arial" w:eastAsia="Arial" w:hAnsi="Arial"/>
-          <w:sz w:val="22"/>
-          <w:szCs w:val="22"/>
-        </w:rPr>
-        <w:t xml:space="preserve">Adjacent or overlapping flagged windows are merged into contiguous segments. During merging, the maximum amplitude and periodicity are preserved, and frequencies are averaged.</w:t>
-      </w:r>
-    </w:p>
-    <w:p>
-      <w:pPr>
-        <w:pStyle w:val="Heading2"/>
-      </w:pPr>
-      <w:r>
-        <w:t xml:space="preserve">4.4 Baseline Computation</w:t>
-      </w:r>
-    </w:p>
-    <w:p>
-      <w:pPr>
-        <w:spacing w:after="120"/>
-      </w:pPr>
-      <w:r>
-        <w:rPr>
-          <w:rFonts w:ascii="Arial" w:cs="Arial" w:eastAsia="Arial" w:hAnsi="Arial"/>
-          <w:sz w:val="22"/>
-          <w:szCs w:val="22"/>
-        </w:rPr>
-        <w:t xml:space="preserve">For each merged segment, the application computes:</w:t>
-      </w:r>
-    </w:p>
-    <w:p>
-      <w:pPr>
-        <w:pStyle w:val="ListParagraph"/>
-        <w:numPr>
-          <w:ilvl w:val="0"/>
-          <w:numId w:val="2"/>
-        </w:numPr>
-        <w:spacing w:after="60"/>
-      </w:pPr>
-      <w:r>
-        <w:rPr>
-          <w:rFonts w:ascii="Arial" w:cs="Arial" w:eastAsia="Arial" w:hAnsi="Arial"/>
-          <w:sz w:val="22"/>
-          <w:szCs w:val="22"/>
-        </w:rPr>
-        <w:t xml:space="preserve">Pre-baseline: The maximum raw signal value in the 10-second window immediately before the segment starts.</w:t>
-      </w:r>
-    </w:p>
-    <w:p>
-      <w:pPr>
-        <w:pStyle w:val="ListParagraph"/>
-        <w:numPr>
-          <w:ilvl w:val="0"/>
-          <w:numId w:val="2"/>
-        </w:numPr>
-        <w:spacing w:after="60"/>
-      </w:pPr>
-      <w:r>
-        <w:rPr>
-          <w:rFonts w:ascii="Arial" w:cs="Arial" w:eastAsia="Arial" w:hAnsi="Arial"/>
-          <w:sz w:val="22"/>
-          <w:szCs w:val="22"/>
-        </w:rPr>
-        <w:t xml:space="preserve">Post-baseline: The maximum raw signal value in the 10-second window immediately after the segment ends (if data is available).</w:t>
-      </w:r>
-    </w:p>
-    <w:p>
-      <w:pPr>
-        <w:spacing w:after="120"/>
-      </w:pPr>
-      <w:r>
-        <w:rPr>
-          <w:rFonts w:ascii="Arial" w:cs="Arial" w:eastAsia="Arial" w:hAnsi="Arial"/>
-          <w:sz w:val="22"/>
-          <w:szCs w:val="22"/>
-        </w:rPr>
-        <w:t xml:space="preserve">These baselines help assess whether the step noise is causing a DC offset shift in the channel.</w:t>
+        <w:t xml:space="preserve">Toolbar parameters are stored in step_noise_finder_config.json next to the app. It is rewritten every time you change a value. To reset to defaults, delete the file.</w:t>
       </w:r>
     </w:p>
     <w:p>
@@ -2457,211 +3419,7 @@
         <w:pStyle w:val="Heading1"/>
       </w:pPr>
       <w:r>
-        <w:t xml:space="preserve">5. Typical Workflow</w:t>
-      </w:r>
-    </w:p>
-    <w:p>
-      <w:pPr>
-        <w:pStyle w:val="Heading2"/>
-      </w:pPr>
-      <w:r>
-        <w:t xml:space="preserve">5.1 Single File Analysis</w:t>
-      </w:r>
-    </w:p>
-    <w:p>
-      <w:pPr>
-        <w:pStyle w:val="ListParagraph"/>
-        <w:numPr>
-          <w:ilvl w:val="0"/>
-          <w:numId w:val="3"/>
-        </w:numPr>
-        <w:spacing w:after="60"/>
-      </w:pPr>
-      <w:r>
-        <w:rPr>
-          <w:rFonts w:ascii="Arial" w:cs="Arial" w:eastAsia="Arial" w:hAnsi="Arial"/>
-          <w:sz w:val="22"/>
-          <w:szCs w:val="22"/>
-        </w:rPr>
-        <w:t xml:space="preserve">Click File → Open TDD… or press Ctrl+O.</w:t>
-      </w:r>
-    </w:p>
-    <w:p>
-      <w:pPr>
-        <w:pStyle w:val="ListParagraph"/>
-        <w:numPr>
-          <w:ilvl w:val="0"/>
-          <w:numId w:val="3"/>
-        </w:numPr>
-        <w:spacing w:after="60"/>
-      </w:pPr>
-      <w:r>
-        <w:rPr>
-          <w:rFonts w:ascii="Arial" w:cs="Arial" w:eastAsia="Arial" w:hAnsi="Arial"/>
-          <w:sz w:val="22"/>
-          <w:szCs w:val="22"/>
-        </w:rPr>
-        <w:t xml:space="preserve">Select a TDD baseline file.</w:t>
-      </w:r>
-    </w:p>
-    <w:p>
-      <w:pPr>
-        <w:pStyle w:val="ListParagraph"/>
-        <w:numPr>
-          <w:ilvl w:val="0"/>
-          <w:numId w:val="3"/>
-        </w:numPr>
-        <w:spacing w:after="60"/>
-      </w:pPr>
-      <w:r>
-        <w:rPr>
-          <w:rFonts w:ascii="Arial" w:cs="Arial" w:eastAsia="Arial" w:hAnsi="Arial"/>
-          <w:sz w:val="22"/>
-          <w:szCs w:val="22"/>
-        </w:rPr>
-        <w:t xml:space="preserve">Adjust detection parameters if needed (amplitude, frequency range, periodicity).</w:t>
-      </w:r>
-    </w:p>
-    <w:p>
-      <w:pPr>
-        <w:pStyle w:val="ListParagraph"/>
-        <w:numPr>
-          <w:ilvl w:val="0"/>
-          <w:numId w:val="3"/>
-        </w:numPr>
-        <w:spacing w:after="60"/>
-      </w:pPr>
-      <w:r>
-        <w:rPr>
-          <w:rFonts w:ascii="Arial" w:cs="Arial" w:eastAsia="Arial" w:hAnsi="Arial"/>
-          <w:sz w:val="22"/>
-          <w:szCs w:val="22"/>
-        </w:rPr>
-        <w:t xml:space="preserve">Click Scan All Channels.</w:t>
-      </w:r>
-    </w:p>
-    <w:p>
-      <w:pPr>
-        <w:pStyle w:val="ListParagraph"/>
-        <w:numPr>
-          <w:ilvl w:val="0"/>
-          <w:numId w:val="3"/>
-        </w:numPr>
-        <w:spacing w:after="60"/>
-      </w:pPr>
-      <w:r>
-        <w:rPr>
-          <w:rFonts w:ascii="Arial" w:cs="Arial" w:eastAsia="Arial" w:hAnsi="Arial"/>
-          <w:sz w:val="22"/>
-          <w:szCs w:val="22"/>
-        </w:rPr>
-        <w:t xml:space="preserve">Review results in the table. Click any row to view waveforms.</w:t>
-      </w:r>
-    </w:p>
-    <w:p>
-      <w:pPr>
-        <w:pStyle w:val="Heading2"/>
-      </w:pPr>
-      <w:r>
-        <w:t xml:space="preserve">5.2 Batch Analysis (Multiple Files)</w:t>
-      </w:r>
-    </w:p>
-    <w:p>
-      <w:pPr>
-        <w:pStyle w:val="ListParagraph"/>
-        <w:numPr>
-          <w:ilvl w:val="0"/>
-          <w:numId w:val="3"/>
-        </w:numPr>
-        <w:spacing w:after="60"/>
-      </w:pPr>
-      <w:r>
-        <w:rPr>
-          <w:rFonts w:ascii="Arial" w:cs="Arial" w:eastAsia="Arial" w:hAnsi="Arial"/>
-          <w:sz w:val="22"/>
-          <w:szCs w:val="22"/>
-        </w:rPr>
-        <w:t xml:space="preserve">Click Scan Baselines… button or File → Scan Baselines…</w:t>
-      </w:r>
-    </w:p>
-    <w:p>
-      <w:pPr>
-        <w:pStyle w:val="ListParagraph"/>
-        <w:numPr>
-          <w:ilvl w:val="0"/>
-          <w:numId w:val="3"/>
-        </w:numPr>
-        <w:spacing w:after="60"/>
-      </w:pPr>
-      <w:r>
-        <w:rPr>
-          <w:rFonts w:ascii="Arial" w:cs="Arial" w:eastAsia="Arial" w:hAnsi="Arial"/>
-          <w:sz w:val="22"/>
-          <w:szCs w:val="22"/>
-        </w:rPr>
-        <w:t xml:space="preserve">Navigate to the folder containing baseline TDD files.</w:t>
-      </w:r>
-    </w:p>
-    <w:p>
-      <w:pPr>
-        <w:pStyle w:val="ListParagraph"/>
-        <w:numPr>
-          <w:ilvl w:val="0"/>
-          <w:numId w:val="3"/>
-        </w:numPr>
-        <w:spacing w:after="60"/>
-      </w:pPr>
-      <w:r>
-        <w:rPr>
-          <w:rFonts w:ascii="Arial" w:cs="Arial" w:eastAsia="Arial" w:hAnsi="Arial"/>
-          <w:sz w:val="22"/>
-          <w:szCs w:val="22"/>
-        </w:rPr>
-        <w:t xml:space="preserve">Select one or more *Baseline*.tdd files (use Ctrl+click or Ctrl+A).</w:t>
-      </w:r>
-    </w:p>
-    <w:p>
-      <w:pPr>
-        <w:pStyle w:val="ListParagraph"/>
-        <w:numPr>
-          <w:ilvl w:val="0"/>
-          <w:numId w:val="3"/>
-        </w:numPr>
-        <w:spacing w:after="60"/>
-      </w:pPr>
-      <w:r>
-        <w:rPr>
-          <w:rFonts w:ascii="Arial" w:cs="Arial" w:eastAsia="Arial" w:hAnsi="Arial"/>
-          <w:sz w:val="22"/>
-          <w:szCs w:val="22"/>
-        </w:rPr>
-        <w:t xml:space="preserve">The scan starts automatically across all selected files and all channels.</w:t>
-      </w:r>
-    </w:p>
-    <w:p>
-      <w:pPr>
-        <w:pStyle w:val="ListParagraph"/>
-        <w:numPr>
-          <w:ilvl w:val="0"/>
-          <w:numId w:val="3"/>
-        </w:numPr>
-        <w:spacing w:after="60"/>
-      </w:pPr>
-      <w:r>
-        <w:rPr>
-          <w:rFonts w:ascii="Arial" w:cs="Arial" w:eastAsia="Arial" w:hAnsi="Arial"/>
-          <w:sz w:val="22"/>
-          <w:szCs w:val="22"/>
-        </w:rPr>
-        <w:t xml:space="preserve">Results from all files appear in the same table for comparison.</w:t>
-      </w:r>
-    </w:p>
-    <w:p>
-      <w:pPr>
-        <w:pStyle w:val="Heading1"/>
-      </w:pPr>
-      <w:r>
-        <w:t xml:space="preserve">6. Parameter Tuning Guide</w:t>
+        <w:t xml:space="preserve">7. Parameter Tuning</w:t>
       </w:r>
     </w:p>
     <w:tbl>
@@ -2913,7 +3671,7 @@
                 <w:sz w:val="20"/>
                 <w:szCs w:val="20"/>
               </w:rPr>
-              <w:t xml:space="preserve">100 mV is typical for Nabsys instruments</w:t>
+              <w:t xml:space="preserve">100 mV is typical for Nabsys instruments; try 50 mV if events look clean but aren't reported.</w:t>
             </w:r>
           </w:p>
         </w:tc>
@@ -2969,7 +3727,7 @@
                 <w:sz w:val="20"/>
                 <w:szCs w:val="20"/>
               </w:rPr>
-              <w:t xml:space="preserve">Widen range to catch variable-frequency steps</w:t>
+              <w:t xml:space="preserve">Widen to catch variable-frequency steps</w:t>
             </w:r>
           </w:p>
         </w:tc>
@@ -3023,7 +3781,7 @@
                 <w:sz w:val="20"/>
                 <w:szCs w:val="20"/>
               </w:rPr>
-              <w:t xml:space="preserve">4–20 Hz covers most observed step noise</w:t>
+              <w:t xml:space="preserve">4–20 Hz covers most observed step noise.</w:t>
             </w:r>
           </w:p>
         </w:tc>
@@ -3079,7 +3837,7 @@
                 <w:sz w:val="20"/>
                 <w:szCs w:val="20"/>
               </w:rPr>
-              <w:t xml:space="preserve">Require more regular patterns (fewer false positives)</w:t>
+              <w:t xml:space="preserve">Demand cleaner periodic signals (fewer false positives)</w:t>
             </w:r>
           </w:p>
         </w:tc>
@@ -3106,7 +3864,7 @@
                 <w:sz w:val="20"/>
                 <w:szCs w:val="20"/>
               </w:rPr>
-              <w:t xml:space="preserve">Detect intermittent or irregular step noise</w:t>
+              <w:t xml:space="preserve">Catch irregular or amplitude-modulated events</w:t>
             </w:r>
           </w:p>
         </w:tc>
@@ -3133,7 +3891,227 @@
                 <w:sz w:val="20"/>
                 <w:szCs w:val="20"/>
               </w:rPr>
-              <w:t xml:space="preserve">0.4 is a good balance; below 0.3 may produce false positives</w:t>
+              <w:t xml:space="preserve">0.20 default is fairly permissive; bump to 0.4+ for strict.</w:t>
+            </w:r>
+          </w:p>
+        </w:tc>
+      </w:tr>
+      <w:tr>
+        <w:tc>
+          <w:tcPr>
+            <w:tcW w:type="dxa" w:w="2000"/>
+            <w:tcBorders>
+              <w:top w:val="single" w:color="CCCCCC" w:sz="1"/>
+              <w:left w:val="single" w:color="CCCCCC" w:sz="1"/>
+              <w:bottom w:val="single" w:color="CCCCCC" w:sz="1"/>
+              <w:right w:val="single" w:color="CCCCCC" w:sz="1"/>
+            </w:tcBorders>
+            <w:tcMar>
+              <w:top w:type="dxa" w:w="80"/>
+              <w:left w:type="dxa" w:w="120"/>
+              <w:bottom w:type="dxa" w:w="80"/>
+              <w:right w:type="dxa" w:w="120"/>
+            </w:tcMar>
+          </w:tcPr>
+          <w:p>
+            <w:r>
+              <w:rPr>
+                <w:rFonts w:ascii="Arial" w:cs="Arial" w:eastAsia="Arial" w:hAnsi="Arial"/>
+                <w:sz w:val="20"/>
+                <w:szCs w:val="20"/>
+              </w:rPr>
+              <w:t xml:space="preserve">Gap (s)</w:t>
+            </w:r>
+          </w:p>
+        </w:tc>
+        <w:tc>
+          <w:tcPr>
+            <w:tcW w:type="dxa" w:w="2400"/>
+            <w:tcBorders>
+              <w:top w:val="single" w:color="CCCCCC" w:sz="1"/>
+              <w:left w:val="single" w:color="CCCCCC" w:sz="1"/>
+              <w:bottom w:val="single" w:color="CCCCCC" w:sz="1"/>
+              <w:right w:val="single" w:color="CCCCCC" w:sz="1"/>
+            </w:tcBorders>
+            <w:tcMar>
+              <w:top w:type="dxa" w:w="80"/>
+              <w:left w:type="dxa" w:w="120"/>
+              <w:bottom w:type="dxa" w:w="80"/>
+              <w:right w:type="dxa" w:w="120"/>
+            </w:tcMar>
+          </w:tcPr>
+          <w:p>
+            <w:r>
+              <w:rPr>
+                <w:rFonts w:ascii="Arial" w:cs="Arial" w:eastAsia="Arial" w:hAnsi="Arial"/>
+                <w:sz w:val="20"/>
+                <w:szCs w:val="20"/>
+              </w:rPr>
+              <w:t xml:space="preserve">Merge events across long quiet stretches or across files</w:t>
+            </w:r>
+          </w:p>
+        </w:tc>
+        <w:tc>
+          <w:tcPr>
+            <w:tcW w:type="dxa" w:w="2400"/>
+            <w:tcBorders>
+              <w:top w:val="single" w:color="CCCCCC" w:sz="1"/>
+              <w:left w:val="single" w:color="CCCCCC" w:sz="1"/>
+              <w:bottom w:val="single" w:color="CCCCCC" w:sz="1"/>
+              <w:right w:val="single" w:color="CCCCCC" w:sz="1"/>
+            </w:tcBorders>
+            <w:tcMar>
+              <w:top w:type="dxa" w:w="80"/>
+              <w:left w:type="dxa" w:w="120"/>
+              <w:bottom w:type="dxa" w:w="80"/>
+              <w:right w:type="dxa" w:w="120"/>
+            </w:tcMar>
+          </w:tcPr>
+          <w:p>
+            <w:r>
+              <w:rPr>
+                <w:rFonts w:ascii="Arial" w:cs="Arial" w:eastAsia="Arial" w:hAnsi="Arial"/>
+                <w:sz w:val="20"/>
+                <w:szCs w:val="20"/>
+              </w:rPr>
+              <w:t xml:space="preserve">Keep events more granular</w:t>
+            </w:r>
+          </w:p>
+        </w:tc>
+        <w:tc>
+          <w:tcPr>
+            <w:tcW w:type="dxa" w:w="2560"/>
+            <w:tcBorders>
+              <w:top w:val="single" w:color="CCCCCC" w:sz="1"/>
+              <w:left w:val="single" w:color="CCCCCC" w:sz="1"/>
+              <w:bottom w:val="single" w:color="CCCCCC" w:sz="1"/>
+              <w:right w:val="single" w:color="CCCCCC" w:sz="1"/>
+            </w:tcBorders>
+            <w:tcMar>
+              <w:top w:type="dxa" w:w="80"/>
+              <w:left w:type="dxa" w:w="120"/>
+              <w:bottom w:type="dxa" w:w="80"/>
+              <w:right w:type="dxa" w:w="120"/>
+            </w:tcMar>
+          </w:tcPr>
+          <w:p>
+            <w:r>
+              <w:rPr>
+                <w:rFonts w:ascii="Arial" w:cs="Arial" w:eastAsia="Arial" w:hAnsi="Arial"/>
+                <w:sz w:val="20"/>
+                <w:szCs w:val="20"/>
+              </w:rPr>
+              <w:t xml:space="preserve">Set to ~200 to merge across 30-min files recorded ≈3 min apart.</w:t>
+            </w:r>
+          </w:p>
+        </w:tc>
+      </w:tr>
+      <w:tr>
+        <w:tc>
+          <w:tcPr>
+            <w:tcW w:type="dxa" w:w="2000"/>
+            <w:tcBorders>
+              <w:top w:val="single" w:color="CCCCCC" w:sz="1"/>
+              <w:left w:val="single" w:color="CCCCCC" w:sz="1"/>
+              <w:bottom w:val="single" w:color="CCCCCC" w:sz="1"/>
+              <w:right w:val="single" w:color="CCCCCC" w:sz="1"/>
+            </w:tcBorders>
+            <w:tcMar>
+              <w:top w:type="dxa" w:w="80"/>
+              <w:left w:type="dxa" w:w="120"/>
+              <w:bottom w:type="dxa" w:w="80"/>
+              <w:right w:type="dxa" w:w="120"/>
+            </w:tcMar>
+          </w:tcPr>
+          <w:p>
+            <w:r>
+              <w:rPr>
+                <w:rFonts w:ascii="Arial" w:cs="Arial" w:eastAsia="Arial" w:hAnsi="Arial"/>
+                <w:sz w:val="20"/>
+                <w:szCs w:val="20"/>
+              </w:rPr>
+              <w:t xml:space="preserve">Envelope mode</w:t>
+            </w:r>
+          </w:p>
+        </w:tc>
+        <w:tc>
+          <w:tcPr>
+            <w:tcW w:type="dxa" w:w="2400"/>
+            <w:tcBorders>
+              <w:top w:val="single" w:color="CCCCCC" w:sz="1"/>
+              <w:left w:val="single" w:color="CCCCCC" w:sz="1"/>
+              <w:bottom w:val="single" w:color="CCCCCC" w:sz="1"/>
+              <w:right w:val="single" w:color="CCCCCC" w:sz="1"/>
+            </w:tcBorders>
+            <w:tcMar>
+              <w:top w:type="dxa" w:w="80"/>
+              <w:left w:type="dxa" w:w="120"/>
+              <w:bottom w:type="dxa" w:w="80"/>
+              <w:right w:type="dxa" w:w="120"/>
+            </w:tcMar>
+          </w:tcPr>
+          <w:p>
+            <w:r>
+              <w:rPr>
+                <w:rFonts w:ascii="Arial" w:cs="Arial" w:eastAsia="Arial" w:hAnsi="Arial"/>
+                <w:sz w:val="20"/>
+                <w:szCs w:val="20"/>
+              </w:rPr>
+              <w:t xml:space="preserve">(checkbox — enable for bursty / non-periodic events)</w:t>
+            </w:r>
+          </w:p>
+        </w:tc>
+        <w:tc>
+          <w:tcPr>
+            <w:tcW w:type="dxa" w:w="2400"/>
+            <w:tcBorders>
+              <w:top w:val="single" w:color="CCCCCC" w:sz="1"/>
+              <w:left w:val="single" w:color="CCCCCC" w:sz="1"/>
+              <w:bottom w:val="single" w:color="CCCCCC" w:sz="1"/>
+              <w:right w:val="single" w:color="CCCCCC" w:sz="1"/>
+            </w:tcBorders>
+            <w:tcMar>
+              <w:top w:type="dxa" w:w="80"/>
+              <w:left w:type="dxa" w:w="120"/>
+              <w:bottom w:type="dxa" w:w="80"/>
+              <w:right w:type="dxa" w:w="120"/>
+            </w:tcMar>
+          </w:tcPr>
+          <w:p>
+            <w:r>
+              <w:rPr>
+                <w:rFonts w:ascii="Arial" w:cs="Arial" w:eastAsia="Arial" w:hAnsi="Arial"/>
+                <w:sz w:val="20"/>
+                <w:szCs w:val="20"/>
+              </w:rPr>
+              <w:t xml:space="preserve">(uncheck for strict periodic detection)</w:t>
+            </w:r>
+          </w:p>
+        </w:tc>
+        <w:tc>
+          <w:tcPr>
+            <w:tcW w:type="dxa" w:w="2560"/>
+            <w:tcBorders>
+              <w:top w:val="single" w:color="CCCCCC" w:sz="1"/>
+              <w:left w:val="single" w:color="CCCCCC" w:sz="1"/>
+              <w:bottom w:val="single" w:color="CCCCCC" w:sz="1"/>
+              <w:right w:val="single" w:color="CCCCCC" w:sz="1"/>
+            </w:tcBorders>
+            <w:tcMar>
+              <w:top w:type="dxa" w:w="80"/>
+              <w:left w:type="dxa" w:w="120"/>
+              <w:bottom w:type="dxa" w:w="80"/>
+              <w:right w:type="dxa" w:w="120"/>
+            </w:tcMar>
+          </w:tcPr>
+          <w:p>
+            <w:r>
+              <w:rPr>
+                <w:rFonts w:ascii="Arial" w:cs="Arial" w:eastAsia="Arial" w:hAnsi="Arial"/>
+                <w:sz w:val="20"/>
+                <w:szCs w:val="20"/>
+              </w:rPr>
+              <w:t xml:space="preserve">Best for ragged spike trains in the band; reports peaks/sec as the frequency.</w:t>
             </w:r>
           </w:p>
         </w:tc>
@@ -3144,7 +4122,7 @@
         <w:pStyle w:val="Heading1"/>
       </w:pPr>
       <w:r>
-        <w:t xml:space="preserve">7. Technical Details</w:t>
+        <w:t xml:space="preserve">8. Technical Details</w:t>
       </w:r>
     </w:p>
     <w:p>
@@ -3152,7 +4130,87 @@
         <w:pStyle w:val="Heading2"/>
       </w:pPr>
       <w:r>
-        <w:t xml:space="preserve">7.1 TDD File Format</w:t>
+        <w:t xml:space="preserve">8.1 TDD format</w:t>
+      </w:r>
+    </w:p>
+    <w:p>
+      <w:pPr>
+        <w:pStyle w:val="ListParagraph"/>
+        <w:numPr>
+          <w:ilvl w:val="0"/>
+          <w:numId w:val="2"/>
+        </w:numPr>
+        <w:spacing w:after="60"/>
+      </w:pPr>
+      <w:r>
+        <w:rPr>
+          <w:rFonts w:ascii="Arial" w:cs="Arial" w:eastAsia="Arial" w:hAnsi="Arial"/>
+          <w:sz w:val="22"/>
+          <w:szCs w:val="22"/>
+        </w:rPr>
+        <w:t xml:space="preserve">Magic 0x5342414E ("NABS", little-endian).</w:t>
+      </w:r>
+    </w:p>
+    <w:p>
+      <w:pPr>
+        <w:pStyle w:val="ListParagraph"/>
+        <w:numPr>
+          <w:ilvl w:val="0"/>
+          <w:numId w:val="2"/>
+        </w:numPr>
+        <w:spacing w:after="60"/>
+      </w:pPr>
+      <w:r>
+        <w:rPr>
+          <w:rFonts w:ascii="Arial" w:cs="Arial" w:eastAsia="Arial" w:hAnsi="Arial"/>
+          <w:sz w:val="22"/>
+          <w:szCs w:val="22"/>
+        </w:rPr>
+        <w:t xml:space="preserve">Per-channel int16 samples interleaved across time.</w:t>
+      </w:r>
+    </w:p>
+    <w:p>
+      <w:pPr>
+        <w:pStyle w:val="ListParagraph"/>
+        <w:numPr>
+          <w:ilvl w:val="0"/>
+          <w:numId w:val="2"/>
+        </w:numPr>
+        <w:spacing w:after="60"/>
+      </w:pPr>
+      <w:r>
+        <w:rPr>
+          <w:rFonts w:ascii="Arial" w:cs="Arial" w:eastAsia="Arial" w:hAnsi="Arial"/>
+          <w:sz w:val="22"/>
+          <w:szCs w:val="22"/>
+        </w:rPr>
+        <w:t xml:space="preserve">Per-channel calibration factors applied during load to convert raw counts to microvolts.</w:t>
+      </w:r>
+    </w:p>
+    <w:p>
+      <w:pPr>
+        <w:pStyle w:val="ListParagraph"/>
+        <w:numPr>
+          <w:ilvl w:val="0"/>
+          <w:numId w:val="2"/>
+        </w:numPr>
+        <w:spacing w:after="60"/>
+      </w:pPr>
+      <w:r>
+        <w:rPr>
+          <w:rFonts w:ascii="Arial" w:cs="Arial" w:eastAsia="Arial" w:hAnsi="Arial"/>
+          <w:sz w:val="22"/>
+          <w:szCs w:val="22"/>
+        </w:rPr>
+        <w:t xml:space="preserve">Header fields used by reports include RunID, DetectorWaferID, DetectorDieNumber, DetectorLotNumber, SystemID, and DataStartTime.</w:t>
+      </w:r>
+    </w:p>
+    <w:p>
+      <w:pPr>
+        <w:pStyle w:val="Heading2"/>
+      </w:pPr>
+      <w:r>
+        <w:t xml:space="preserve">8.2 Channel ordering</w:t>
       </w:r>
     </w:p>
     <w:p>
@@ -3165,7 +4223,15 @@
           <w:sz w:val="22"/>
           <w:szCs w:val="22"/>
         </w:rPr>
-        <w:t xml:space="preserve">The application reads TDD v3.1 binary files produced by Nabsys HD-Mapping instruments. Key details:</w:t>
+        <w:t xml:space="preserve">Channels are recorded in hardware-scrambled order. The reader sorts them numerically (1–2…256) for display and analysis.</w:t>
+      </w:r>
+    </w:p>
+    <w:p>
+      <w:pPr>
+        <w:pStyle w:val="Heading2"/>
+      </w:pPr>
+      <w:r>
+        <w:t xml:space="preserve">8.3 Performance</w:t>
       </w:r>
     </w:p>
     <w:p>
@@ -3183,7 +4249,7 @@
           <w:sz w:val="22"/>
           <w:szCs w:val="22"/>
         </w:rPr>
-        <w:t xml:space="preserve">Magic number: 0x5342414E (NABS, little-endian)</w:t>
+        <w:t xml:space="preserve">FFT autocorrelation — scipy.fft.rfft/irfft replaces direct convolution; ~1700× faster on the inner autocorrelation loop than np.correlate, with float-epsilon-equivalent results.</w:t>
       </w:r>
     </w:p>
     <w:p>
@@ -3201,7 +4267,7 @@
           <w:sz w:val="22"/>
           <w:szCs w:val="22"/>
         </w:rPr>
-        <w:t xml:space="preserve">Data format: interleaved int16 samples, one per channel per time step</w:t>
+        <w:t xml:space="preserve">Channel-level parallelism — ThreadPoolExecutor with min(cpu_count, 8) workers. NumPy/SciPy release the GIL, so Python threads give real parallelism here.</w:t>
       </w:r>
     </w:p>
     <w:p>
@@ -3219,7 +4285,36 @@
           <w:sz w:val="22"/>
           <w:szCs w:val="22"/>
         </w:rPr>
-        <w:t xml:space="preserve">Conversion: raw counts are multiplied by per-channel calibration factors to produce microvolts</w:t>
+        <w:t xml:space="preserve">LRU file cache — bounded by total waveform bytes (8 GB). Older files are evicted automatically as new ones load. If the user clicks a row whose file was evicted, the file is reloaded transparently to render the plot.</w:t>
+      </w:r>
+    </w:p>
+    <w:p>
+      <w:pPr>
+        <w:pStyle w:val="Heading2"/>
+      </w:pPr>
+      <w:r>
+        <w:t xml:space="preserve">8.4 Threading and Tk safety</w:t>
+      </w:r>
+    </w:p>
+    <w:p>
+      <w:pPr>
+        <w:spacing w:after="120"/>
+      </w:pPr>
+      <w:r>
+        <w:rPr>
+          <w:rFonts w:ascii="Arial" w:cs="Arial" w:eastAsia="Arial" w:hAnsi="Arial"/>
+          <w:sz w:val="22"/>
+          <w:szCs w:val="22"/>
+        </w:rPr>
+        <w:t xml:space="preserve">All scanning runs in background threads. Progress and table updates dispatch back to the Tk main thread via root.after(0, …), the only thread-safe Tk update path.</w:t>
+      </w:r>
+    </w:p>
+    <w:p>
+      <w:pPr>
+        <w:pStyle w:val="Heading2"/>
+      </w:pPr>
+      <w:r>
+        <w:t xml:space="preserve">8.5 Dependencies</w:t>
       </w:r>
     </w:p>
     <w:p>
@@ -3237,7 +4332,43 @@
           <w:sz w:val="22"/>
           <w:szCs w:val="22"/>
         </w:rPr>
-        <w:t xml:space="preserve">Typical files: 256 channels at 100 Hz, 30 minutes of data (~88 MB)</w:t>
+        <w:t xml:space="preserve">Python 3.13 (the installed venv version).</w:t>
+      </w:r>
+    </w:p>
+    <w:p>
+      <w:pPr>
+        <w:pStyle w:val="ListParagraph"/>
+        <w:numPr>
+          <w:ilvl w:val="0"/>
+          <w:numId w:val="2"/>
+        </w:numPr>
+        <w:spacing w:after="60"/>
+      </w:pPr>
+      <w:r>
+        <w:rPr>
+          <w:rFonts w:ascii="Arial" w:cs="Arial" w:eastAsia="Arial" w:hAnsi="Arial"/>
+          <w:sz w:val="22"/>
+          <w:szCs w:val="22"/>
+        </w:rPr>
+        <w:t xml:space="preserve">numpy, scipy, matplotlib.</w:t>
+      </w:r>
+    </w:p>
+    <w:p>
+      <w:pPr>
+        <w:pStyle w:val="ListParagraph"/>
+        <w:numPr>
+          <w:ilvl w:val="0"/>
+          <w:numId w:val="2"/>
+        </w:numPr>
+        <w:spacing w:after="60"/>
+      </w:pPr>
+      <w:r>
+        <w:rPr>
+          <w:rFonts w:ascii="Arial" w:cs="Arial" w:eastAsia="Arial" w:hAnsi="Arial"/>
+          <w:sz w:val="22"/>
+          <w:szCs w:val="22"/>
+        </w:rPr>
+        <w:t xml:space="preserve">Optional: sherlock (Nabsys-Organization/sherlock). When installed, RunResults JSON output is enabled.</w:t>
       </w:r>
     </w:p>
     <w:p>
@@ -3245,70 +4376,7 @@
         <w:pStyle w:val="Heading2"/>
       </w:pPr>
       <w:r>
-        <w:t xml:space="preserve">7.2 Channel Ordering</w:t>
-      </w:r>
-    </w:p>
-    <w:p>
-      <w:pPr>
-        <w:spacing w:after="120"/>
-      </w:pPr>
-      <w:r>
-        <w:rPr>
-          <w:rFonts w:ascii="Arial" w:cs="Arial" w:eastAsia="Arial" w:hAnsi="Arial"/>
-          <w:sz w:val="22"/>
-          <w:szCs w:val="22"/>
-        </w:rPr>
-        <w:t xml:space="preserve">Channel IDs in TDD files are in hardware-scrambled order. The application uses a descrambling function to sort channels numerically (1, 2, 3, …, 256) for display and analysis.</w:t>
-      </w:r>
-    </w:p>
-    <w:p>
-      <w:pPr>
-        <w:pStyle w:val="Heading2"/>
-      </w:pPr>
-      <w:r>
-        <w:t xml:space="preserve">7.3 Memory Management</w:t>
-      </w:r>
-    </w:p>
-    <w:p>
-      <w:pPr>
-        <w:spacing w:after="120"/>
-      </w:pPr>
-      <w:r>
-        <w:rPr>
-          <w:rFonts w:ascii="Arial" w:cs="Arial" w:eastAsia="Arial" w:hAnsi="Arial"/>
-          <w:sz w:val="22"/>
-          <w:szCs w:val="22"/>
-        </w:rPr>
-        <w:t xml:space="preserve">During batch scanning, the application caches loaded file data for plotting. Files without detections are evicted from the cache to conserve memory. Files with detections are retained so their waveforms can be viewed by clicking result rows.</w:t>
-      </w:r>
-    </w:p>
-    <w:p>
-      <w:pPr>
-        <w:pStyle w:val="Heading2"/>
-      </w:pPr>
-      <w:r>
-        <w:t xml:space="preserve">7.4 Threading</w:t>
-      </w:r>
-    </w:p>
-    <w:p>
-      <w:pPr>
-        <w:spacing w:after="120"/>
-      </w:pPr>
-      <w:r>
-        <w:rPr>
-          <w:rFonts w:ascii="Arial" w:cs="Arial" w:eastAsia="Arial" w:hAnsi="Arial"/>
-          <w:sz w:val="22"/>
-          <w:szCs w:val="22"/>
-        </w:rPr>
-        <w:t xml:space="preserve">All scanning runs in a background thread to keep the GUI responsive. Progress updates are dispatched to the main thread via tkinter’s after() mechanism.</w:t>
-      </w:r>
-    </w:p>
-    <w:p>
-      <w:pPr>
-        <w:pStyle w:val="Heading2"/>
-      </w:pPr>
-      <w:r>
-        <w:t xml:space="preserve">7.5 Dependencies</w:t>
+        <w:t xml:space="preserve">8.6 Source layout</w:t>
       </w:r>
     </w:p>
     <w:p>
@@ -3326,7 +4394,7 @@
           <w:sz w:val="22"/>
           <w:szCs w:val="22"/>
         </w:rPr>
-        <w:t xml:space="preserve">Python 3.11+</w:t>
+        <w:t xml:space="preserve">src/step_finder.py — main GUI and detection.</w:t>
       </w:r>
     </w:p>
     <w:p>
@@ -3344,7 +4412,7 @@
           <w:sz w:val="22"/>
           <w:szCs w:val="22"/>
         </w:rPr>
-        <w:t xml:space="preserve">NumPy ≥ 1.24.0 — array operations</w:t>
+        <w:t xml:space="preserve">src/tdd_reader.py — TDD v3.1 binary parser.</w:t>
       </w:r>
     </w:p>
     <w:p>
@@ -3362,7 +4430,7 @@
           <w:sz w:val="22"/>
           <w:szCs w:val="22"/>
         </w:rPr>
-        <w:t xml:space="preserve">SciPy ≥ 1.10.0 — Butterworth filter, zero-phase filtering</w:t>
+        <w:t xml:space="preserve">src/plot_results.py — helper to plot channel-vs-step-noise across all results/*.json.</w:t>
       </w:r>
     </w:p>
     <w:p>
@@ -3380,7 +4448,7 @@
           <w:sz w:val="22"/>
           <w:szCs w:val="22"/>
         </w:rPr>
-        <w:t xml:space="preserve">Matplotlib ≥ 3.7.0 — embedded plots with tkinter backend</w:t>
+        <w:t xml:space="preserve">doc/gen_finder_guide.js — source for this user guide; run with node to regenerate the docx.</w:t>
       </w:r>
     </w:p>
     <w:sectPr>
@@ -3519,7 +4587,7 @@
         <w:sz w:val="18"/>
         <w:szCs w:val="18"/>
       </w:rPr>
-      <w:t xml:space="preserve">Step Noise Finder — User Guide</w:t>
+      <w:t xml:space="preserve">Step Noise Finder — User Guide  v1.2.0</w:t>
     </w:r>
   </w:p>
 </w:hdr>

</xml_diff>